<commit_message>
RegDin 13 - TokenizationAPI Wallets - Digitization y LifeCycle
</commit_message>
<xml_diff>
--- a/WALLETS_MASTERCARD/REGDIN013 - 900241_Modificaciones en TokenizationAPI para Wallets MasterCard.docx
+++ b/WALLETS_MASTERCARD/REGDIN013 - 900241_Modificaciones en TokenizationAPI para Wallets MasterCard.docx
@@ -52,12 +52,12 @@
         </w:tblCellMar>
       </w:tblPr>
       <w:tblGrid>
-        <w:gridCol w:w="1180"/>
+        <w:gridCol w:w="1179"/>
         <w:gridCol w:w="2211"/>
-        <w:gridCol w:w="1258"/>
-        <w:gridCol w:w="1674"/>
-        <w:gridCol w:w="1688"/>
-        <w:gridCol w:w="1962"/>
+        <w:gridCol w:w="1259"/>
+        <w:gridCol w:w="1673"/>
+        <w:gridCol w:w="1689"/>
+        <w:gridCol w:w="1961"/>
       </w:tblGrid>
       <w:tr>
         <w:trPr>
@@ -65,7 +65,7 @@
         </w:trPr>
         <w:tc>
           <w:tcPr>
-            <w:tcW w:w="1180" w:type="dxa"/>
+            <w:tcW w:w="1179" w:type="dxa"/>
             <w:tcBorders>
               <w:top w:val="single" w:sz="4" w:space="0" w:color="000000"/>
               <w:left w:val="single" w:sz="4" w:space="0" w:color="000000"/>
@@ -141,7 +141,7 @@
         </w:tc>
         <w:tc>
           <w:tcPr>
-            <w:tcW w:w="1258" w:type="dxa"/>
+            <w:tcW w:w="1259" w:type="dxa"/>
             <w:tcBorders>
               <w:top w:val="single" w:sz="4" w:space="0" w:color="000000"/>
               <w:left w:val="single" w:sz="4" w:space="0" w:color="000000"/>
@@ -179,7 +179,7 @@
         </w:tc>
         <w:tc>
           <w:tcPr>
-            <w:tcW w:w="1674" w:type="dxa"/>
+            <w:tcW w:w="1673" w:type="dxa"/>
             <w:tcBorders>
               <w:top w:val="single" w:sz="4" w:space="0" w:color="000000"/>
               <w:left w:val="single" w:sz="4" w:space="0" w:color="000000"/>
@@ -217,7 +217,7 @@
         </w:tc>
         <w:tc>
           <w:tcPr>
-            <w:tcW w:w="1688" w:type="dxa"/>
+            <w:tcW w:w="1689" w:type="dxa"/>
             <w:tcBorders>
               <w:top w:val="single" w:sz="4" w:space="0" w:color="000000"/>
               <w:left w:val="single" w:sz="4" w:space="0" w:color="000000"/>
@@ -255,7 +255,7 @@
         </w:tc>
         <w:tc>
           <w:tcPr>
-            <w:tcW w:w="1962" w:type="dxa"/>
+            <w:tcW w:w="1961" w:type="dxa"/>
             <w:tcBorders>
               <w:top w:val="single" w:sz="4" w:space="0" w:color="000000"/>
               <w:left w:val="single" w:sz="4" w:space="0" w:color="000000"/>
@@ -298,7 +298,7 @@
         </w:trPr>
         <w:tc>
           <w:tcPr>
-            <w:tcW w:w="1180" w:type="dxa"/>
+            <w:tcW w:w="1179" w:type="dxa"/>
             <w:tcBorders>
               <w:top w:val="single" w:sz="4" w:space="0" w:color="000000"/>
               <w:left w:val="single" w:sz="4" w:space="0" w:color="000000"/>
@@ -368,7 +368,7 @@
         </w:tc>
         <w:tc>
           <w:tcPr>
-            <w:tcW w:w="1258" w:type="dxa"/>
+            <w:tcW w:w="1259" w:type="dxa"/>
             <w:tcBorders>
               <w:top w:val="single" w:sz="4" w:space="0" w:color="000000"/>
               <w:left w:val="single" w:sz="4" w:space="0" w:color="000000"/>
@@ -405,7 +405,7 @@
                     <w:kern w:val="0"/>
                     <w:sz w:val="18"/>
                     <w:szCs w:val="18"/>
-                    <w:lang w:val="es" w:bidi="ar-SA"/>
+                    <w:lang w:val="es-ES" w:bidi="ar-SA"/>
                   </w:rPr>
                 </w:r>
                 <w:r>
@@ -414,20 +414,17 @@
                     <w:kern w:val="0"/>
                     <w:sz w:val="18"/>
                     <w:szCs w:val="18"/>
-                    <w:lang w:val="es" w:bidi="ar-SA"/>
+                    <w:lang w:val="es-ES" w:bidi="ar-SA"/>
                   </w:rPr>
                   <w:t>17/8/2026</w:t>
                 </w:r>
-                <w:r>
-                  <w:rPr/>
-                </w:r>
               </w:sdtContent>
             </w:sdt>
           </w:p>
         </w:tc>
         <w:tc>
           <w:tcPr>
-            <w:tcW w:w="1674" w:type="dxa"/>
+            <w:tcW w:w="1673" w:type="dxa"/>
             <w:tcBorders>
               <w:top w:val="single" w:sz="4" w:space="0" w:color="000000"/>
               <w:left w:val="single" w:sz="4" w:space="0" w:color="000000"/>
@@ -460,7 +457,7 @@
         </w:tc>
         <w:tc>
           <w:tcPr>
-            <w:tcW w:w="1688" w:type="dxa"/>
+            <w:tcW w:w="1689" w:type="dxa"/>
             <w:tcBorders>
               <w:top w:val="single" w:sz="4" w:space="0" w:color="000000"/>
               <w:left w:val="single" w:sz="4" w:space="0" w:color="000000"/>
@@ -495,7 +492,7 @@
         </w:tc>
         <w:tc>
           <w:tcPr>
-            <w:tcW w:w="1962" w:type="dxa"/>
+            <w:tcW w:w="1961" w:type="dxa"/>
             <w:tcBorders>
               <w:top w:val="single" w:sz="4" w:space="0" w:color="000000"/>
               <w:left w:val="single" w:sz="4" w:space="0" w:color="000000"/>
@@ -533,7 +530,7 @@
         </w:trPr>
         <w:tc>
           <w:tcPr>
-            <w:tcW w:w="1180" w:type="dxa"/>
+            <w:tcW w:w="1179" w:type="dxa"/>
             <w:tcBorders>
               <w:top w:val="single" w:sz="4" w:space="0" w:color="000000"/>
               <w:left w:val="single" w:sz="4" w:space="0" w:color="000000"/>
@@ -597,7 +594,7 @@
         </w:tc>
         <w:tc>
           <w:tcPr>
-            <w:tcW w:w="1258" w:type="dxa"/>
+            <w:tcW w:w="1259" w:type="dxa"/>
             <w:tcBorders>
               <w:top w:val="single" w:sz="4" w:space="0" w:color="000000"/>
               <w:left w:val="single" w:sz="4" w:space="0" w:color="000000"/>
@@ -629,7 +626,7 @@
         </w:tc>
         <w:tc>
           <w:tcPr>
-            <w:tcW w:w="1674" w:type="dxa"/>
+            <w:tcW w:w="1673" w:type="dxa"/>
             <w:tcBorders>
               <w:top w:val="single" w:sz="4" w:space="0" w:color="000000"/>
               <w:left w:val="single" w:sz="4" w:space="0" w:color="000000"/>
@@ -661,7 +658,7 @@
         </w:tc>
         <w:tc>
           <w:tcPr>
-            <w:tcW w:w="1688" w:type="dxa"/>
+            <w:tcW w:w="1689" w:type="dxa"/>
             <w:tcBorders>
               <w:top w:val="single" w:sz="4" w:space="0" w:color="000000"/>
               <w:left w:val="single" w:sz="4" w:space="0" w:color="000000"/>
@@ -693,7 +690,7 @@
         </w:tc>
         <w:tc>
           <w:tcPr>
-            <w:tcW w:w="1962" w:type="dxa"/>
+            <w:tcW w:w="1961" w:type="dxa"/>
             <w:tcBorders>
               <w:top w:val="single" w:sz="4" w:space="0" w:color="000000"/>
               <w:left w:val="single" w:sz="4" w:space="0" w:color="000000"/>
@@ -777,7 +774,7 @@
         <w:gridCol w:w="1445"/>
         <w:gridCol w:w="2013"/>
         <w:gridCol w:w="1692"/>
-        <w:gridCol w:w="1540"/>
+        <w:gridCol w:w="1539"/>
         <w:gridCol w:w="1589"/>
       </w:tblGrid>
       <w:tr>
@@ -940,7 +937,7 @@
         </w:tc>
         <w:tc>
           <w:tcPr>
-            <w:tcW w:w="1540" w:type="dxa"/>
+            <w:tcW w:w="1539" w:type="dxa"/>
             <w:tcBorders>
               <w:top w:val="single" w:sz="4" w:space="0" w:color="000000"/>
               <w:left w:val="single" w:sz="4" w:space="0" w:color="000000"/>
@@ -1164,7 +1161,7 @@
         </w:tc>
         <w:tc>
           <w:tcPr>
-            <w:tcW w:w="1540" w:type="dxa"/>
+            <w:tcW w:w="1539" w:type="dxa"/>
             <w:tcBorders>
               <w:top w:val="single" w:sz="4" w:space="0" w:color="000000"/>
               <w:left w:val="single" w:sz="4" w:space="0" w:color="000000"/>
@@ -1323,7 +1320,7 @@
         </w:tblCellMar>
       </w:tblPr>
       <w:tblGrid>
-        <w:gridCol w:w="5785"/>
+        <w:gridCol w:w="5784"/>
         <w:gridCol w:w="1472"/>
         <w:gridCol w:w="1298"/>
         <w:gridCol w:w="1525"/>
@@ -1332,7 +1329,7 @@
         <w:trPr/>
         <w:tc>
           <w:tcPr>
-            <w:tcW w:w="5785" w:type="dxa"/>
+            <w:tcW w:w="5784" w:type="dxa"/>
             <w:vMerge w:val="restart"/>
             <w:tcBorders>
               <w:top w:val="double" w:sz="4" w:space="0" w:color="000000"/>
@@ -1412,7 +1409,7 @@
         <w:trPr/>
         <w:tc>
           <w:tcPr>
-            <w:tcW w:w="5785" w:type="dxa"/>
+            <w:tcW w:w="5784" w:type="dxa"/>
             <w:vMerge w:val="continue"/>
             <w:tcBorders>
               <w:top w:val="double" w:sz="4" w:space="0" w:color="000000"/>
@@ -1427,7 +1424,7 @@
               <w:pStyle w:val="Normal"/>
               <w:widowControl/>
               <w:suppressAutoHyphens w:val="true"/>
-              <w:overflowPunct w:val="false"/>
+              <w:overflowPunct w:val="true"/>
               <w:bidi w:val="0"/>
               <w:spacing w:before="0" w:after="240"/>
               <w:jc w:val="left"/>
@@ -1555,7 +1552,7 @@
         <w:trPr/>
         <w:tc>
           <w:tcPr>
-            <w:tcW w:w="5785" w:type="dxa"/>
+            <w:tcW w:w="5784" w:type="dxa"/>
             <w:tcBorders>
               <w:top w:val="double" w:sz="4" w:space="0" w:color="000000"/>
               <w:left w:val="double" w:sz="4" w:space="0" w:color="000000"/>
@@ -1621,20 +1618,7 @@
                 <w:szCs w:val="20"/>
                 <w:lang w:bidi="ar-SA"/>
               </w:rPr>
-              <w:t xml:space="preserve">-: Api </w:t>
-            </w:r>
-            <w:r>
-              <w:rPr>
-                <w:rFonts w:eastAsia="Times New Roman" w:cs="Arial" w:ascii="Georgia" w:hAnsi="Georgia"/>
-                <w:b/>
-                <w:bCs/>
-                <w:color w:val="000000"/>
-                <w:kern w:val="0"/>
-                <w:sz w:val="20"/>
-                <w:szCs w:val="20"/>
-                <w:lang w:bidi="ar-SA"/>
-              </w:rPr>
-              <w:t>DigitizationNotification :-</w:t>
+              <w:t>-: Api DigitizationNotification :-</w:t>
             </w:r>
           </w:p>
           <w:p>
@@ -1672,7 +1656,7 @@
               <w:widowControl/>
               <w:numPr>
                 <w:ilvl w:val="0"/>
-                <w:numId w:val="4"/>
+                <w:numId w:val="3"/>
               </w:numPr>
               <w:spacing w:before="0" w:after="0"/>
               <w:jc w:val="both"/>
@@ -1688,55 +1672,7 @@
                 <w:szCs w:val="18"/>
                 <w:lang w:bidi="ar-SA"/>
               </w:rPr>
-              <w:t xml:space="preserve">Se realiza la </w:t>
-            </w:r>
-            <w:r>
-              <w:rPr>
-                <w:rFonts w:eastAsia="Times New Roman" w:cs="Arial" w:ascii="Arial" w:hAnsi="Arial"/>
-                <w:b/>
-                <w:bCs/>
-                <w:kern w:val="0"/>
-                <w:sz w:val="18"/>
-                <w:szCs w:val="18"/>
-                <w:lang w:bidi="ar-SA"/>
-              </w:rPr>
-              <w:t>p</w:t>
-            </w:r>
-            <w:r>
-              <w:rPr>
-                <w:rFonts w:eastAsia="Times New Roman" w:cs="Arial" w:ascii="Arial" w:hAnsi="Arial"/>
-                <w:b/>
-                <w:bCs/>
-                <w:kern w:val="0"/>
-                <w:sz w:val="18"/>
-                <w:szCs w:val="18"/>
-                <w:lang w:bidi="ar-SA"/>
-              </w:rPr>
-              <w:t>arametriza</w:t>
-            </w:r>
-            <w:r>
-              <w:rPr>
-                <w:rFonts w:eastAsia="Times New Roman" w:cs="Arial" w:ascii="Arial" w:hAnsi="Arial"/>
-                <w:b/>
-                <w:bCs/>
-                <w:kern w:val="0"/>
-                <w:sz w:val="18"/>
-                <w:szCs w:val="18"/>
-                <w:lang w:bidi="ar-SA"/>
-              </w:rPr>
-              <w:t>ción de</w:t>
-            </w:r>
-            <w:r>
-              <w:rPr>
-                <w:rFonts w:eastAsia="Times New Roman" w:cs="Arial" w:ascii="Arial" w:hAnsi="Arial"/>
-                <w:b/>
-                <w:bCs/>
-                <w:kern w:val="0"/>
-                <w:sz w:val="18"/>
-                <w:szCs w:val="18"/>
-                <w:lang w:bidi="ar-SA"/>
-              </w:rPr>
-              <w:t xml:space="preserve"> los nuevos TokenRequestorId para MDES:</w:t>
+              <w:t>Se realiza la parametrización de los nuevos TokenRequestorId para MDES:</w:t>
             </w:r>
           </w:p>
           <w:p>
@@ -1762,7 +1698,13 @@
             </w:pPr>
             <w:r>
               <w:rPr>
-                <w:color w:val="0000FF"/>
+                <w:rFonts w:eastAsia="Times New Roman" w:cs="Arial" w:ascii="Arial" w:hAnsi="Arial"/>
+                <w:b/>
+                <w:bCs/>
+                <w:kern w:val="0"/>
+                <w:sz w:val="18"/>
+                <w:szCs w:val="18"/>
+                <w:lang w:bidi="ar-SA"/>
               </w:rPr>
             </w:r>
           </w:p>
@@ -1772,7 +1714,7 @@
               <w:widowControl/>
               <w:numPr>
                 <w:ilvl w:val="1"/>
-                <w:numId w:val="4"/>
+                <w:numId w:val="3"/>
               </w:numPr>
               <w:spacing w:before="0" w:after="0"/>
               <w:jc w:val="both"/>
@@ -1791,20 +1733,7 @@
                 <w:szCs w:val="18"/>
                 <w:lang w:bidi="ar-SA"/>
               </w:rPr>
-              <w:t>A</w:t>
-            </w:r>
-            <w:r>
-              <w:rPr>
-                <w:rFonts w:eastAsia="Times New Roman" w:cs="Arial" w:ascii="Arial" w:hAnsi="Arial"/>
-                <w:b/>
-                <w:bCs/>
-                <w:color w:val="000080"/>
-                <w:kern w:val="0"/>
-                <w:sz w:val="18"/>
-                <w:szCs w:val="18"/>
-                <w:lang w:bidi="ar-SA"/>
-              </w:rPr>
-              <w:t>pplePay - 50110030273</w:t>
+              <w:t>ApplePay - 50110030273</w:t>
             </w:r>
           </w:p>
           <w:p>
@@ -1813,7 +1742,7 @@
               <w:widowControl/>
               <w:numPr>
                 <w:ilvl w:val="1"/>
-                <w:numId w:val="4"/>
+                <w:numId w:val="3"/>
               </w:numPr>
               <w:spacing w:before="0" w:after="0"/>
               <w:jc w:val="both"/>
@@ -1899,10 +1828,10 @@
               <w:widowControl/>
               <w:numPr>
                 <w:ilvl w:val="0"/>
-                <w:numId w:val="4"/>
+                <w:numId w:val="3"/>
               </w:numPr>
               <w:suppressAutoHyphens w:val="true"/>
-              <w:overflowPunct w:val="false"/>
+              <w:overflowPunct w:val="true"/>
               <w:bidi w:val="0"/>
               <w:spacing w:before="0" w:after="0"/>
               <w:jc w:val="both"/>
@@ -1929,72 +1858,7 @@
                 <w:szCs w:val="18"/>
                 <w:lang w:val="es-SV" w:eastAsia="en-US" w:bidi="ar-SA"/>
               </w:rPr>
-              <w:t xml:space="preserve">Prueba de </w:t>
-            </w:r>
-            <w:r>
-              <w:rPr>
-                <w:rFonts w:eastAsia="Times New Roman" w:cs="Arial" w:ascii="Arial" w:hAnsi="Arial"/>
-                <w:b/>
-                <w:bCs/>
-                <w:color w:val="000000"/>
-                <w:kern w:val="0"/>
-                <w:sz w:val="18"/>
-                <w:szCs w:val="18"/>
-                <w:lang w:val="es-SV" w:eastAsia="en-US" w:bidi="ar-SA"/>
-              </w:rPr>
-              <w:t xml:space="preserve">Billetera </w:t>
-            </w:r>
-            <w:r>
-              <w:rPr>
-                <w:rFonts w:eastAsia="Times New Roman" w:cs="Arial" w:ascii="Arial" w:hAnsi="Arial"/>
-                <w:b/>
-                <w:bCs/>
-                <w:color w:val="000000"/>
-                <w:kern w:val="0"/>
-                <w:sz w:val="18"/>
-                <w:szCs w:val="18"/>
-                <w:lang w:val="es-SV" w:eastAsia="en-US" w:bidi="ar-SA"/>
-              </w:rPr>
-              <w:t xml:space="preserve">ApplePay - </w:t>
-            </w:r>
-            <w:r>
-              <w:rPr>
-                <w:rFonts w:eastAsia="Times New Roman" w:cs="Arial" w:ascii="Arial" w:hAnsi="Arial"/>
-                <w:b/>
-                <w:bCs/>
-                <w:color w:val="000000"/>
-                <w:kern w:val="0"/>
-                <w:sz w:val="18"/>
-                <w:szCs w:val="18"/>
-                <w:lang w:val="es-SV" w:eastAsia="en-US" w:bidi="ar-SA"/>
-              </w:rPr>
-              <w:t>50110030273</w:t>
-            </w:r>
-            <w:r>
-              <w:rPr>
-                <w:rFonts w:eastAsia="Times New Roman" w:cs="Arial" w:ascii="Arial" w:hAnsi="Arial"/>
-                <w:b/>
-                <w:bCs/>
-                <w:color w:val="000000"/>
-                <w:kern w:val="0"/>
-                <w:sz w:val="18"/>
-                <w:szCs w:val="18"/>
-                <w:lang w:val="es-SV" w:eastAsia="en-US" w:bidi="ar-SA"/>
-              </w:rPr>
-              <w:t>) con tokenRefId de MasterCard</w:t>
-            </w:r>
-            <w:r>
-              <w:rPr>
-                <w:rFonts w:eastAsia="Times New Roman" w:cs="Arial" w:ascii="Arial" w:hAnsi="Arial"/>
-                <w:b/>
-                <w:bCs/>
-                <w:color w:val="000000"/>
-                <w:kern w:val="0"/>
-                <w:sz w:val="18"/>
-                <w:szCs w:val="18"/>
-                <w:lang w:val="es-SV" w:eastAsia="en-US" w:bidi="ar-SA"/>
-              </w:rPr>
-              <w:t>:</w:t>
+              <w:t>Prueba de Billetera ApplePay - 50110030273) con tokenRefId de MasterCard:</w:t>
             </w:r>
           </w:p>
           <w:p>
@@ -2002,7 +1866,7 @@
               <w:pStyle w:val="Header"/>
               <w:widowControl/>
               <w:suppressAutoHyphens w:val="true"/>
-              <w:overflowPunct w:val="false"/>
+              <w:overflowPunct w:val="true"/>
               <w:bidi w:val="0"/>
               <w:spacing w:before="0" w:after="0"/>
               <w:jc w:val="both"/>
@@ -2036,7 +1900,7 @@
               <w:pStyle w:val="Header"/>
               <w:widowControl/>
               <w:suppressAutoHyphens w:val="true"/>
-              <w:overflowPunct w:val="false"/>
+              <w:overflowPunct w:val="true"/>
               <w:bidi w:val="0"/>
               <w:spacing w:before="0" w:after="0"/>
               <w:jc w:val="both"/>
@@ -2064,7 +1928,7 @@
                 <w:lang w:val="es-SV" w:eastAsia="en-US" w:bidi="ar-SA"/>
               </w:rPr>
               <w:drawing>
-                <wp:anchor behindDoc="0" distT="0" distB="0" distL="0" distR="0" simplePos="0" locked="0" layoutInCell="0" allowOverlap="1" relativeHeight="10">
+                <wp:anchor behindDoc="0" distT="0" distB="0" distL="0" distR="0" simplePos="0" locked="0" layoutInCell="0" allowOverlap="1" relativeHeight="16">
                   <wp:simplePos x="0" y="0"/>
                   <wp:positionH relativeFrom="column">
                     <wp:align>center</wp:align>
@@ -2115,7 +1979,7 @@
               <w:pStyle w:val="Header"/>
               <w:widowControl/>
               <w:suppressAutoHyphens w:val="true"/>
-              <w:overflowPunct w:val="false"/>
+              <w:overflowPunct w:val="true"/>
               <w:bidi w:val="0"/>
               <w:spacing w:before="0" w:after="0"/>
               <w:jc w:val="both"/>
@@ -2150,10 +2014,10 @@
               <w:widowControl/>
               <w:numPr>
                 <w:ilvl w:val="0"/>
-                <w:numId w:val="4"/>
+                <w:numId w:val="3"/>
               </w:numPr>
               <w:suppressAutoHyphens w:val="true"/>
-              <w:overflowPunct w:val="false"/>
+              <w:overflowPunct w:val="true"/>
               <w:bidi w:val="0"/>
               <w:spacing w:before="0" w:after="0"/>
               <w:jc w:val="both"/>
@@ -2180,46 +2044,7 @@
                 <w:szCs w:val="18"/>
                 <w:lang w:val="es-SV" w:eastAsia="en-US" w:bidi="ar-SA"/>
               </w:rPr>
-              <w:t>Response</w:t>
-            </w:r>
-            <w:r>
-              <w:rPr>
-                <w:rFonts w:eastAsia="Times New Roman" w:cs="Arial" w:ascii="Arial" w:hAnsi="Arial"/>
-                <w:b/>
-                <w:bCs/>
-                <w:color w:val="000000"/>
-                <w:kern w:val="0"/>
-                <w:sz w:val="18"/>
-                <w:szCs w:val="18"/>
-                <w:lang w:val="es-SV" w:eastAsia="en-US" w:bidi="ar-SA"/>
-              </w:rPr>
-              <w:t xml:space="preserve"> </w:t>
-            </w:r>
-            <w:r>
-              <w:rPr>
-                <w:rFonts w:eastAsia="Times New Roman" w:cs="Arial" w:ascii="Arial" w:hAnsi="Arial"/>
-                <w:b/>
-                <w:bCs/>
-                <w:color w:val="000000"/>
-                <w:kern w:val="0"/>
-                <w:sz w:val="18"/>
-                <w:szCs w:val="18"/>
-                <w:lang w:val="es-SV" w:eastAsia="en-US" w:bidi="ar-SA"/>
-              </w:rPr>
-              <w:t>del api (00)</w:t>
-            </w:r>
-            <w:r>
-              <w:rPr>
-                <w:rFonts w:eastAsia="Times New Roman" w:cs="Arial" w:ascii="Arial" w:hAnsi="Arial"/>
-                <w:b/>
-                <w:bCs/>
-                <w:color w:val="000000"/>
-                <w:kern w:val="0"/>
-                <w:sz w:val="18"/>
-                <w:szCs w:val="18"/>
-                <w:lang w:val="es-SV" w:eastAsia="en-US" w:bidi="ar-SA"/>
-              </w:rPr>
-              <w:t>:</w:t>
+              <w:t>Response del api (00):</w:t>
             </w:r>
           </w:p>
           <w:p>
@@ -2227,7 +2052,7 @@
               <w:pStyle w:val="Header"/>
               <w:widowControl/>
               <w:suppressAutoHyphens w:val="true"/>
-              <w:overflowPunct w:val="false"/>
+              <w:overflowPunct w:val="true"/>
               <w:bidi w:val="0"/>
               <w:spacing w:before="0" w:after="0"/>
               <w:jc w:val="both"/>
@@ -2261,7 +2086,7 @@
               <w:pStyle w:val="Header"/>
               <w:widowControl/>
               <w:suppressAutoHyphens w:val="true"/>
-              <w:overflowPunct w:val="false"/>
+              <w:overflowPunct w:val="true"/>
               <w:bidi w:val="0"/>
               <w:spacing w:before="0" w:after="0"/>
               <w:jc w:val="both"/>
@@ -2289,7 +2114,7 @@
                 <w:lang w:val="es-SV" w:eastAsia="en-US" w:bidi="ar-SA"/>
               </w:rPr>
               <w:drawing>
-                <wp:anchor behindDoc="0" distT="0" distB="0" distL="0" distR="0" simplePos="0" locked="0" layoutInCell="0" allowOverlap="1" relativeHeight="6">
+                <wp:anchor behindDoc="0" distT="0" distB="0" distL="0" distR="0" simplePos="0" locked="0" layoutInCell="0" allowOverlap="1" relativeHeight="12">
                   <wp:simplePos x="0" y="0"/>
                   <wp:positionH relativeFrom="column">
                     <wp:align>center</wp:align>
@@ -2340,7 +2165,7 @@
               <w:pStyle w:val="Header"/>
               <w:widowControl/>
               <w:suppressAutoHyphens w:val="true"/>
-              <w:overflowPunct w:val="false"/>
+              <w:overflowPunct w:val="true"/>
               <w:bidi w:val="0"/>
               <w:spacing w:before="0" w:after="0"/>
               <w:jc w:val="both"/>
@@ -2375,10 +2200,10 @@
               <w:widowControl/>
               <w:numPr>
                 <w:ilvl w:val="0"/>
-                <w:numId w:val="4"/>
+                <w:numId w:val="3"/>
               </w:numPr>
               <w:suppressAutoHyphens w:val="true"/>
-              <w:overflowPunct w:val="false"/>
+              <w:overflowPunct w:val="true"/>
               <w:bidi w:val="0"/>
               <w:spacing w:before="0" w:after="0"/>
               <w:jc w:val="both"/>
@@ -2396,33 +2221,7 @@
                 <w:szCs w:val="18"/>
                 <w:lang w:val="es-SV" w:eastAsia="en-US" w:bidi="ar-SA"/>
               </w:rPr>
-              <w:t xml:space="preserve">Verificación de que el registro de la digitalización se </w:t>
-            </w:r>
-            <w:r>
-              <w:rPr>
-                <w:rFonts w:eastAsia="Times New Roman" w:cs="Arial" w:ascii="Arial" w:hAnsi="Arial"/>
-                <w:b/>
-                <w:bCs/>
-                <w:color w:val="auto"/>
-                <w:kern w:val="0"/>
-                <w:sz w:val="18"/>
-                <w:szCs w:val="18"/>
-                <w:lang w:val="es-SV" w:eastAsia="en-US" w:bidi="ar-SA"/>
-              </w:rPr>
-              <w:t>encuentre creado  con el estatus CREATED</w:t>
-            </w:r>
-            <w:r>
-              <w:rPr>
-                <w:rFonts w:eastAsia="Times New Roman" w:cs="Arial" w:ascii="Arial" w:hAnsi="Arial"/>
-                <w:b/>
-                <w:bCs/>
-                <w:color w:val="auto"/>
-                <w:kern w:val="0"/>
-                <w:sz w:val="18"/>
-                <w:szCs w:val="18"/>
-                <w:lang w:val="es-SV" w:eastAsia="en-US" w:bidi="ar-SA"/>
-              </w:rPr>
-              <w:t xml:space="preserve"> en la tabla (</w:t>
+              <w:t>Verificación de que el registro de la digitalización se encuentre creado  con el estatus CREATED en la tabla (</w:t>
             </w:r>
             <w:r>
               <w:rPr>
@@ -2431,16 +2230,7 @@
                 <w:sz w:val="20"/>
                 <w:shd w:fill="F0D8A8" w:val="clear"/>
               </w:rPr>
-              <w:t>TOKENIZATION_REGISTRO_VALIDATION</w:t>
-            </w:r>
-            <w:r>
-              <w:rPr>
-                <w:rFonts w:ascii="Consolas" w:hAnsi="Consolas"/>
-                <w:color w:val="000080"/>
-                <w:sz w:val="20"/>
-                <w:shd w:fill="F0D8A8" w:val="clear"/>
-              </w:rPr>
-              <w:t>)</w:t>
+              <w:t>TOKENIZATION_REGISTRO_VALIDATION)</w:t>
             </w:r>
             <w:r>
               <w:rPr>
@@ -2461,7 +2251,7 @@
               <w:pStyle w:val="Header"/>
               <w:widowControl/>
               <w:suppressAutoHyphens w:val="true"/>
-              <w:overflowPunct w:val="false"/>
+              <w:overflowPunct w:val="true"/>
               <w:bidi w:val="0"/>
               <w:spacing w:before="0" w:after="0"/>
               <w:jc w:val="both"/>
@@ -2495,7 +2285,7 @@
               <w:pStyle w:val="Header"/>
               <w:widowControl/>
               <w:suppressAutoHyphens w:val="true"/>
-              <w:overflowPunct w:val="false"/>
+              <w:overflowPunct w:val="true"/>
               <w:bidi w:val="0"/>
               <w:spacing w:before="0" w:after="0"/>
               <w:jc w:val="both"/>
@@ -2525,7 +2315,7 @@
               <w:pStyle w:val="Header"/>
               <w:widowControl/>
               <w:suppressAutoHyphens w:val="true"/>
-              <w:overflowPunct w:val="false"/>
+              <w:overflowPunct w:val="true"/>
               <w:bidi w:val="0"/>
               <w:spacing w:before="0" w:after="0"/>
               <w:jc w:val="both"/>
@@ -2555,7 +2345,7 @@
               <w:pStyle w:val="Header"/>
               <w:widowControl/>
               <w:suppressAutoHyphens w:val="true"/>
-              <w:overflowPunct w:val="false"/>
+              <w:overflowPunct w:val="true"/>
               <w:bidi w:val="0"/>
               <w:spacing w:before="0" w:after="0"/>
               <w:jc w:val="both"/>
@@ -2579,7 +2369,7 @@
                 <w:lang w:bidi="ar-SA"/>
               </w:rPr>
               <w:drawing>
-                <wp:anchor behindDoc="0" distT="0" distB="0" distL="0" distR="0" simplePos="0" locked="0" layoutInCell="0" allowOverlap="1" relativeHeight="4">
+                <wp:anchor behindDoc="0" distT="0" distB="0" distL="0" distR="0" simplePos="0" locked="0" layoutInCell="0" allowOverlap="1" relativeHeight="10">
                   <wp:simplePos x="0" y="0"/>
                   <wp:positionH relativeFrom="column">
                     <wp:align>center</wp:align>
@@ -2630,7 +2420,7 @@
               <w:pStyle w:val="Header"/>
               <w:widowControl/>
               <w:suppressAutoHyphens w:val="true"/>
-              <w:overflowPunct w:val="false"/>
+              <w:overflowPunct w:val="true"/>
               <w:bidi w:val="0"/>
               <w:spacing w:before="0" w:after="0"/>
               <w:jc w:val="both"/>
@@ -2689,10 +2479,10 @@
               <w:widowControl/>
               <w:numPr>
                 <w:ilvl w:val="0"/>
-                <w:numId w:val="3"/>
+                <w:numId w:val="2"/>
               </w:numPr>
               <w:suppressAutoHyphens w:val="true"/>
-              <w:overflowPunct w:val="false"/>
+              <w:overflowPunct w:val="true"/>
               <w:bidi w:val="0"/>
               <w:spacing w:before="0" w:after="0"/>
               <w:jc w:val="both"/>
@@ -2719,72 +2509,7 @@
                 <w:szCs w:val="18"/>
                 <w:lang w:val="es-SV" w:eastAsia="en-US" w:bidi="ar-SA"/>
               </w:rPr>
-              <w:t xml:space="preserve">Prueba de </w:t>
-            </w:r>
-            <w:r>
-              <w:rPr>
-                <w:rFonts w:eastAsia="Times New Roman" w:cs="Arial" w:ascii="Arial" w:hAnsi="Arial"/>
-                <w:b/>
-                <w:bCs/>
-                <w:color w:val="000000"/>
-                <w:kern w:val="0"/>
-                <w:sz w:val="18"/>
-                <w:szCs w:val="18"/>
-                <w:lang w:val="es-SV" w:eastAsia="en-US" w:bidi="ar-SA"/>
-              </w:rPr>
-              <w:t xml:space="preserve">Billetera </w:t>
-            </w:r>
-            <w:r>
-              <w:rPr>
-                <w:rFonts w:eastAsia="Times New Roman" w:cs="Arial" w:ascii="Arial" w:hAnsi="Arial"/>
-                <w:b/>
-                <w:bCs/>
-                <w:color w:val="000000"/>
-                <w:kern w:val="0"/>
-                <w:sz w:val="18"/>
-                <w:szCs w:val="18"/>
-                <w:lang w:val="es-SV" w:eastAsia="en-US" w:bidi="ar-SA"/>
-              </w:rPr>
-              <w:t>Google</w:t>
-            </w:r>
-            <w:r>
-              <w:rPr>
-                <w:rFonts w:eastAsia="Times New Roman" w:cs="Arial" w:ascii="Arial" w:hAnsi="Arial"/>
-                <w:b/>
-                <w:bCs/>
-                <w:color w:val="000000"/>
-                <w:kern w:val="0"/>
-                <w:sz w:val="18"/>
-                <w:szCs w:val="18"/>
-                <w:lang w:val="es-SV" w:eastAsia="en-US" w:bidi="ar-SA"/>
-              </w:rPr>
-              <w:t>Pay - 50120834693</w:t>
-            </w:r>
-            <w:r>
-              <w:rPr>
-                <w:rFonts w:eastAsia="Times New Roman" w:cs="Arial" w:ascii="Arial" w:hAnsi="Arial"/>
-                <w:b/>
-                <w:bCs/>
-                <w:color w:val="000000"/>
-                <w:kern w:val="0"/>
-                <w:sz w:val="18"/>
-                <w:szCs w:val="18"/>
-                <w:lang w:val="es-SV" w:eastAsia="en-US" w:bidi="ar-SA"/>
-              </w:rPr>
-              <w:t>) con tokenRefId de MasterCard</w:t>
-            </w:r>
-            <w:r>
-              <w:rPr>
-                <w:rFonts w:eastAsia="Times New Roman" w:cs="Arial" w:ascii="Arial" w:hAnsi="Arial"/>
-                <w:b/>
-                <w:bCs/>
-                <w:color w:val="000000"/>
-                <w:kern w:val="0"/>
-                <w:sz w:val="18"/>
-                <w:szCs w:val="18"/>
-                <w:lang w:val="es-SV" w:eastAsia="en-US" w:bidi="ar-SA"/>
-              </w:rPr>
-              <w:t>:</w:t>
+              <w:t>Prueba de Billetera GooglePay - 50120834693) con tokenRefId de MasterCard:</w:t>
             </w:r>
           </w:p>
           <w:p>
@@ -2792,7 +2517,7 @@
               <w:pStyle w:val="Header"/>
               <w:widowControl/>
               <w:suppressAutoHyphens w:val="true"/>
-              <w:overflowPunct w:val="false"/>
+              <w:overflowPunct w:val="true"/>
               <w:bidi w:val="0"/>
               <w:spacing w:before="0" w:after="0"/>
               <w:jc w:val="left"/>
@@ -2826,7 +2551,7 @@
               <w:pStyle w:val="Header"/>
               <w:widowControl/>
               <w:suppressAutoHyphens w:val="true"/>
-              <w:overflowPunct w:val="false"/>
+              <w:overflowPunct w:val="true"/>
               <w:bidi w:val="0"/>
               <w:spacing w:before="0" w:after="0"/>
               <w:jc w:val="left"/>
@@ -2846,7 +2571,7 @@
                 <w:szCs w:val="18"/>
               </w:rPr>
               <w:drawing>
-                <wp:anchor behindDoc="0" distT="0" distB="0" distL="0" distR="0" simplePos="0" locked="0" layoutInCell="0" allowOverlap="1" relativeHeight="20">
+                <wp:anchor behindDoc="0" distT="0" distB="0" distL="0" distR="0" simplePos="0" locked="0" layoutInCell="0" allowOverlap="1" relativeHeight="27">
                   <wp:simplePos x="0" y="0"/>
                   <wp:positionH relativeFrom="column">
                     <wp:align>center</wp:align>
@@ -2909,7 +2634,14 @@
               </w:rPr>
             </w:pPr>
             <w:r>
-              <w:rPr/>
+              <w:rPr>
+                <w:rFonts w:cs="Arial" w:ascii="Arial" w:hAnsi="Arial"/>
+                <w:b/>
+                <w:bCs/>
+                <w:color w:val="008000"/>
+                <w:sz w:val="18"/>
+                <w:szCs w:val="18"/>
+              </w:rPr>
             </w:r>
           </w:p>
           <w:p>
@@ -2918,10 +2650,10 @@
               <w:widowControl/>
               <w:numPr>
                 <w:ilvl w:val="0"/>
-                <w:numId w:val="4"/>
+                <w:numId w:val="3"/>
               </w:numPr>
               <w:suppressAutoHyphens w:val="true"/>
-              <w:overflowPunct w:val="false"/>
+              <w:overflowPunct w:val="true"/>
               <w:bidi w:val="0"/>
               <w:spacing w:before="0" w:after="0"/>
               <w:jc w:val="both"/>
@@ -2948,46 +2680,7 @@
                 <w:szCs w:val="18"/>
                 <w:lang w:val="es-SV" w:eastAsia="en-US" w:bidi="ar-SA"/>
               </w:rPr>
-              <w:t>Response</w:t>
-            </w:r>
-            <w:r>
-              <w:rPr>
-                <w:rFonts w:eastAsia="Times New Roman" w:cs="Arial" w:ascii="Arial" w:hAnsi="Arial"/>
-                <w:b/>
-                <w:bCs/>
-                <w:color w:val="000000"/>
-                <w:kern w:val="0"/>
-                <w:sz w:val="18"/>
-                <w:szCs w:val="18"/>
-                <w:lang w:val="es-SV" w:eastAsia="en-US" w:bidi="ar-SA"/>
-              </w:rPr>
-              <w:t xml:space="preserve"> </w:t>
-            </w:r>
-            <w:r>
-              <w:rPr>
-                <w:rFonts w:eastAsia="Times New Roman" w:cs="Arial" w:ascii="Arial" w:hAnsi="Arial"/>
-                <w:b/>
-                <w:bCs/>
-                <w:color w:val="000000"/>
-                <w:kern w:val="0"/>
-                <w:sz w:val="18"/>
-                <w:szCs w:val="18"/>
-                <w:lang w:val="es-SV" w:eastAsia="en-US" w:bidi="ar-SA"/>
-              </w:rPr>
-              <w:t>del api (00)</w:t>
-            </w:r>
-            <w:r>
-              <w:rPr>
-                <w:rFonts w:eastAsia="Times New Roman" w:cs="Arial" w:ascii="Arial" w:hAnsi="Arial"/>
-                <w:b/>
-                <w:bCs/>
-                <w:color w:val="000000"/>
-                <w:kern w:val="0"/>
-                <w:sz w:val="18"/>
-                <w:szCs w:val="18"/>
-                <w:lang w:val="es-SV" w:eastAsia="en-US" w:bidi="ar-SA"/>
-              </w:rPr>
-              <w:t>:</w:t>
+              <w:t>Response del api (00):</w:t>
             </w:r>
           </w:p>
           <w:p>
@@ -2995,7 +2688,7 @@
               <w:pStyle w:val="Header"/>
               <w:widowControl/>
               <w:suppressAutoHyphens w:val="true"/>
-              <w:overflowPunct w:val="false"/>
+              <w:overflowPunct w:val="true"/>
               <w:bidi w:val="0"/>
               <w:spacing w:before="0" w:after="0"/>
               <w:jc w:val="both"/>
@@ -3029,7 +2722,7 @@
               <w:pStyle w:val="Header"/>
               <w:widowControl/>
               <w:suppressAutoHyphens w:val="true"/>
-              <w:overflowPunct w:val="false"/>
+              <w:overflowPunct w:val="true"/>
               <w:bidi w:val="0"/>
               <w:spacing w:before="0" w:after="0"/>
               <w:jc w:val="both"/>
@@ -3057,7 +2750,7 @@
                 <w:lang w:val="es-SV" w:eastAsia="en-US" w:bidi="ar-SA"/>
               </w:rPr>
               <w:drawing>
-                <wp:anchor behindDoc="0" distT="0" distB="0" distL="0" distR="0" simplePos="0" locked="0" layoutInCell="0" allowOverlap="1" relativeHeight="19">
+                <wp:anchor behindDoc="0" distT="0" distB="0" distL="0" distR="0" simplePos="0" locked="0" layoutInCell="0" allowOverlap="1" relativeHeight="26">
                   <wp:simplePos x="0" y="0"/>
                   <wp:positionH relativeFrom="column">
                     <wp:align>center</wp:align>
@@ -3108,7 +2801,7 @@
               <w:pStyle w:val="Header"/>
               <w:widowControl/>
               <w:suppressAutoHyphens w:val="true"/>
-              <w:overflowPunct w:val="false"/>
+              <w:overflowPunct w:val="true"/>
               <w:bidi w:val="0"/>
               <w:spacing w:before="0" w:after="0"/>
               <w:jc w:val="both"/>
@@ -3143,10 +2836,10 @@
               <w:widowControl/>
               <w:numPr>
                 <w:ilvl w:val="0"/>
-                <w:numId w:val="4"/>
+                <w:numId w:val="3"/>
               </w:numPr>
               <w:suppressAutoHyphens w:val="true"/>
-              <w:overflowPunct w:val="false"/>
+              <w:overflowPunct w:val="true"/>
               <w:bidi w:val="0"/>
               <w:spacing w:before="0" w:after="0"/>
               <w:jc w:val="both"/>
@@ -3164,33 +2857,7 @@
                 <w:szCs w:val="18"/>
                 <w:lang w:val="es-SV" w:eastAsia="en-US" w:bidi="ar-SA"/>
               </w:rPr>
-              <w:t xml:space="preserve">Verificación de que el registro de la digitalización se </w:t>
-            </w:r>
-            <w:r>
-              <w:rPr>
-                <w:rFonts w:eastAsia="Times New Roman" w:cs="Arial" w:ascii="Arial" w:hAnsi="Arial"/>
-                <w:b/>
-                <w:bCs/>
-                <w:color w:val="auto"/>
-                <w:kern w:val="0"/>
-                <w:sz w:val="18"/>
-                <w:szCs w:val="18"/>
-                <w:lang w:val="es-SV" w:eastAsia="en-US" w:bidi="ar-SA"/>
-              </w:rPr>
-              <w:t>encuentre creado  con el estatus CREATED</w:t>
-            </w:r>
-            <w:r>
-              <w:rPr>
-                <w:rFonts w:eastAsia="Times New Roman" w:cs="Arial" w:ascii="Arial" w:hAnsi="Arial"/>
-                <w:b/>
-                <w:bCs/>
-                <w:color w:val="auto"/>
-                <w:kern w:val="0"/>
-                <w:sz w:val="18"/>
-                <w:szCs w:val="18"/>
-                <w:lang w:val="es-SV" w:eastAsia="en-US" w:bidi="ar-SA"/>
-              </w:rPr>
-              <w:t xml:space="preserve"> en la tabla</w:t>
+              <w:t>Verificación de que el registro de la digitalización se encuentre creado  con el estatus CREATED en la tabla</w:t>
             </w:r>
             <w:r>
               <w:rPr>
@@ -3209,16 +2876,7 @@
                 <w:sz w:val="20"/>
                 <w:shd w:fill="F0D8A8" w:val="clear"/>
               </w:rPr>
-              <w:t>TOKENIZATION_REGISTRO_VALIDATION</w:t>
-            </w:r>
-            <w:r>
-              <w:rPr>
-                <w:rFonts w:ascii="Consolas" w:hAnsi="Consolas"/>
-                <w:color w:val="000080"/>
-                <w:sz w:val="20"/>
-                <w:shd w:fill="F0D8A8" w:val="clear"/>
-              </w:rPr>
-              <w:t>)</w:t>
+              <w:t>TOKENIZATION_REGISTRO_VALIDATION)</w:t>
             </w:r>
             <w:r>
               <w:rPr>
@@ -3296,7 +2954,7 @@
                 <w:szCs w:val="18"/>
               </w:rPr>
               <w:drawing>
-                <wp:anchor behindDoc="0" distT="0" distB="0" distL="0" distR="0" simplePos="0" locked="0" layoutInCell="0" allowOverlap="1" relativeHeight="11">
+                <wp:anchor behindDoc="0" distT="0" distB="0" distL="0" distR="0" simplePos="0" locked="0" layoutInCell="0" allowOverlap="1" relativeHeight="17">
                   <wp:simplePos x="0" y="0"/>
                   <wp:positionH relativeFrom="column">
                     <wp:align>center</wp:align>
@@ -3357,14 +3015,10 @@
             </w:pPr>
             <w:r>
               <w:rPr>
-                <w:rFonts w:eastAsia="Times New Roman" w:cs="Arial" w:ascii="Arial" w:hAnsi="Arial"/>
-                <w:b/>
-                <w:bCs/>
-                <w:color w:val="000000"/>
-                <w:kern w:val="0"/>
-                <w:sz w:val="18"/>
-                <w:szCs w:val="18"/>
-                <w:lang w:val="es-SV" w:eastAsia="en-US" w:bidi="ar-SA"/>
+                <w:rFonts w:cs="Arial" w:ascii="Arial" w:hAnsi="Arial"/>
+                <w:bCs/>
+                <w:sz w:val="18"/>
+                <w:szCs w:val="18"/>
               </w:rPr>
             </w:r>
           </w:p>
@@ -3373,7 +3027,7 @@
               <w:pStyle w:val="Header"/>
               <w:widowControl/>
               <w:suppressAutoHyphens w:val="true"/>
-              <w:overflowPunct w:val="false"/>
+              <w:overflowPunct w:val="true"/>
               <w:bidi w:val="0"/>
               <w:spacing w:before="0" w:after="0"/>
               <w:jc w:val="left"/>
@@ -3431,33 +3085,7 @@
                 <w:szCs w:val="18"/>
                 <w:lang w:bidi="ar-SA"/>
               </w:rPr>
-              <w:t xml:space="preserve">-: Api </w:t>
-            </w:r>
-            <w:r>
-              <w:rPr>
-                <w:rFonts w:eastAsia="Times New Roman" w:cs="Arial" w:ascii="Arial" w:hAnsi="Arial"/>
-                <w:b/>
-                <w:bCs/>
-                <w:color w:val="FF0000"/>
-                <w:kern w:val="0"/>
-                <w:sz w:val="18"/>
-                <w:szCs w:val="18"/>
-                <w:lang w:bidi="ar-SA"/>
-              </w:rPr>
-              <w:t>Pruebas de NO afectación a wallets de VISA</w:t>
-            </w:r>
-            <w:r>
-              <w:rPr>
-                <w:rFonts w:eastAsia="Times New Roman" w:cs="Arial" w:ascii="Arial" w:hAnsi="Arial"/>
-                <w:b/>
-                <w:bCs/>
-                <w:color w:val="FF0000"/>
-                <w:kern w:val="0"/>
-                <w:sz w:val="18"/>
-                <w:szCs w:val="18"/>
-                <w:lang w:bidi="ar-SA"/>
-              </w:rPr>
-              <w:t xml:space="preserve"> :-</w:t>
+              <w:t>-: Api Pruebas de NO afectación a wallets de VISA :-</w:t>
             </w:r>
           </w:p>
           <w:p>
@@ -3528,10 +3156,10 @@
               <w:widowControl/>
               <w:numPr>
                 <w:ilvl w:val="0"/>
-                <w:numId w:val="3"/>
+                <w:numId w:val="2"/>
               </w:numPr>
               <w:suppressAutoHyphens w:val="true"/>
-              <w:overflowPunct w:val="false"/>
+              <w:overflowPunct w:val="true"/>
               <w:bidi w:val="0"/>
               <w:spacing w:before="0" w:after="0"/>
               <w:jc w:val="both"/>
@@ -3558,85 +3186,7 @@
                 <w:szCs w:val="18"/>
                 <w:lang w:val="es-SV" w:eastAsia="en-US" w:bidi="ar-SA"/>
               </w:rPr>
-              <w:t xml:space="preserve">Prueba de </w:t>
-            </w:r>
-            <w:r>
-              <w:rPr>
-                <w:rFonts w:eastAsia="Times New Roman" w:cs="Arial" w:ascii="Arial" w:hAnsi="Arial"/>
-                <w:b/>
-                <w:bCs/>
-                <w:color w:val="000000"/>
-                <w:kern w:val="0"/>
-                <w:sz w:val="18"/>
-                <w:szCs w:val="18"/>
-                <w:lang w:val="es-SV" w:eastAsia="en-US" w:bidi="ar-SA"/>
-              </w:rPr>
-              <w:t xml:space="preserve">Billetera </w:t>
-            </w:r>
-            <w:r>
-              <w:rPr>
-                <w:rFonts w:eastAsia="Times New Roman" w:cs="Arial" w:ascii="Arial" w:hAnsi="Arial"/>
-                <w:b/>
-                <w:bCs/>
-                <w:color w:val="000000"/>
-                <w:kern w:val="0"/>
-                <w:sz w:val="18"/>
-                <w:szCs w:val="18"/>
-                <w:lang w:val="es-SV" w:eastAsia="en-US" w:bidi="ar-SA"/>
-              </w:rPr>
-              <w:t>Google</w:t>
-            </w:r>
-            <w:r>
-              <w:rPr>
-                <w:rFonts w:eastAsia="Times New Roman" w:cs="Arial" w:ascii="Arial" w:hAnsi="Arial"/>
-                <w:b/>
-                <w:bCs/>
-                <w:color w:val="000000"/>
-                <w:kern w:val="0"/>
-                <w:sz w:val="18"/>
-                <w:szCs w:val="18"/>
-                <w:lang w:val="es-SV" w:eastAsia="en-US" w:bidi="ar-SA"/>
-              </w:rPr>
-              <w:t>Pay - 50120834693</w:t>
-            </w:r>
-            <w:r>
-              <w:rPr>
-                <w:rFonts w:eastAsia="Times New Roman" w:cs="Arial" w:ascii="Arial" w:hAnsi="Arial"/>
-                <w:b/>
-                <w:bCs/>
-                <w:color w:val="000000"/>
-                <w:kern w:val="0"/>
-                <w:sz w:val="18"/>
-                <w:szCs w:val="18"/>
-                <w:lang w:val="es-SV" w:eastAsia="en-US" w:bidi="ar-SA"/>
-              </w:rPr>
-              <w:t xml:space="preserve">) con tokenRefId de </w:t>
-            </w:r>
-            <w:r>
-              <w:rPr>
-                <w:rFonts w:eastAsia="Times New Roman" w:cs="Arial" w:ascii="Arial" w:hAnsi="Arial"/>
-                <w:b/>
-                <w:bCs/>
-                <w:color w:val="000000"/>
-                <w:kern w:val="0"/>
-                <w:sz w:val="18"/>
-                <w:szCs w:val="18"/>
-                <w:lang w:val="es-SV" w:eastAsia="en-US" w:bidi="ar-SA"/>
-              </w:rPr>
-              <w:t>VISA</w:t>
-            </w:r>
-            <w:r>
-              <w:rPr>
-                <w:rFonts w:eastAsia="Times New Roman" w:cs="Arial" w:ascii="Arial" w:hAnsi="Arial"/>
-                <w:b/>
-                <w:bCs/>
-                <w:color w:val="000000"/>
-                <w:kern w:val="0"/>
-                <w:sz w:val="18"/>
-                <w:szCs w:val="18"/>
-                <w:lang w:val="es-SV" w:eastAsia="en-US" w:bidi="ar-SA"/>
-              </w:rPr>
-              <w:t>:</w:t>
+              <w:t>Prueba de Billetera GooglePay - 50120834693) con tokenRefId de VISA:</w:t>
             </w:r>
           </w:p>
           <w:p>
@@ -3731,7 +3281,7 @@
                 <w:lang w:bidi="ar-SA"/>
               </w:rPr>
               <w:drawing>
-                <wp:anchor behindDoc="0" distT="0" distB="0" distL="0" distR="0" simplePos="0" locked="0" layoutInCell="0" allowOverlap="1" relativeHeight="18">
+                <wp:anchor behindDoc="0" distT="0" distB="0" distL="0" distR="0" simplePos="0" locked="0" layoutInCell="0" allowOverlap="1" relativeHeight="24">
                   <wp:simplePos x="0" y="0"/>
                   <wp:positionH relativeFrom="column">
                     <wp:align>center</wp:align>
@@ -3814,10 +3364,10 @@
               <w:widowControl/>
               <w:numPr>
                 <w:ilvl w:val="0"/>
-                <w:numId w:val="4"/>
+                <w:numId w:val="3"/>
               </w:numPr>
               <w:suppressAutoHyphens w:val="true"/>
-              <w:overflowPunct w:val="false"/>
+              <w:overflowPunct w:val="true"/>
               <w:bidi w:val="0"/>
               <w:spacing w:before="0" w:after="0"/>
               <w:jc w:val="both"/>
@@ -3844,46 +3394,7 @@
                 <w:szCs w:val="18"/>
                 <w:lang w:val="es-SV" w:eastAsia="en-US" w:bidi="ar-SA"/>
               </w:rPr>
-              <w:t>Response</w:t>
-            </w:r>
-            <w:r>
-              <w:rPr>
-                <w:rFonts w:eastAsia="Times New Roman" w:cs="Arial" w:ascii="Arial" w:hAnsi="Arial"/>
-                <w:b/>
-                <w:bCs/>
-                <w:color w:val="000000"/>
-                <w:kern w:val="0"/>
-                <w:sz w:val="18"/>
-                <w:szCs w:val="18"/>
-                <w:lang w:val="es-SV" w:eastAsia="en-US" w:bidi="ar-SA"/>
-              </w:rPr>
-              <w:t xml:space="preserve"> </w:t>
-            </w:r>
-            <w:r>
-              <w:rPr>
-                <w:rFonts w:eastAsia="Times New Roman" w:cs="Arial" w:ascii="Arial" w:hAnsi="Arial"/>
-                <w:b/>
-                <w:bCs/>
-                <w:color w:val="000000"/>
-                <w:kern w:val="0"/>
-                <w:sz w:val="18"/>
-                <w:szCs w:val="18"/>
-                <w:lang w:val="es-SV" w:eastAsia="en-US" w:bidi="ar-SA"/>
-              </w:rPr>
-              <w:t>del api (00)</w:t>
-            </w:r>
-            <w:r>
-              <w:rPr>
-                <w:rFonts w:eastAsia="Times New Roman" w:cs="Arial" w:ascii="Arial" w:hAnsi="Arial"/>
-                <w:b/>
-                <w:bCs/>
-                <w:color w:val="000000"/>
-                <w:kern w:val="0"/>
-                <w:sz w:val="18"/>
-                <w:szCs w:val="18"/>
-                <w:lang w:val="es-SV" w:eastAsia="en-US" w:bidi="ar-SA"/>
-              </w:rPr>
-              <w:t>:</w:t>
+              <w:t>Response del api (00):</w:t>
             </w:r>
           </w:p>
           <w:p>
@@ -3891,7 +3402,7 @@
               <w:pStyle w:val="Header"/>
               <w:widowControl/>
               <w:suppressAutoHyphens w:val="true"/>
-              <w:overflowPunct w:val="false"/>
+              <w:overflowPunct w:val="true"/>
               <w:bidi w:val="0"/>
               <w:spacing w:before="0" w:after="0"/>
               <w:jc w:val="left"/>
@@ -3925,7 +3436,7 @@
               <w:pStyle w:val="Header"/>
               <w:widowControl/>
               <w:suppressAutoHyphens w:val="true"/>
-              <w:overflowPunct w:val="false"/>
+              <w:overflowPunct w:val="true"/>
               <w:bidi w:val="0"/>
               <w:spacing w:before="0" w:after="0"/>
               <w:jc w:val="left"/>
@@ -3953,7 +3464,7 @@
                 <w:lang w:val="es-SV" w:eastAsia="en-US" w:bidi="ar-SA"/>
               </w:rPr>
               <w:drawing>
-                <wp:anchor behindDoc="0" distT="0" distB="0" distL="0" distR="0" simplePos="0" locked="0" layoutInCell="0" allowOverlap="1" relativeHeight="16">
+                <wp:anchor behindDoc="0" distT="0" distB="0" distL="0" distR="0" simplePos="0" locked="0" layoutInCell="0" allowOverlap="1" relativeHeight="22">
                   <wp:simplePos x="0" y="0"/>
                   <wp:positionH relativeFrom="column">
                     <wp:align>center</wp:align>
@@ -4004,7 +3515,7 @@
               <w:pStyle w:val="Header"/>
               <w:widowControl/>
               <w:suppressAutoHyphens w:val="true"/>
-              <w:overflowPunct w:val="false"/>
+              <w:overflowPunct w:val="true"/>
               <w:bidi w:val="0"/>
               <w:spacing w:before="0" w:after="0"/>
               <w:jc w:val="left"/>
@@ -4039,10 +3550,10 @@
               <w:widowControl/>
               <w:numPr>
                 <w:ilvl w:val="0"/>
-                <w:numId w:val="4"/>
+                <w:numId w:val="3"/>
               </w:numPr>
               <w:suppressAutoHyphens w:val="true"/>
-              <w:overflowPunct w:val="false"/>
+              <w:overflowPunct w:val="true"/>
               <w:bidi w:val="0"/>
               <w:spacing w:before="0" w:after="0"/>
               <w:jc w:val="both"/>
@@ -4060,33 +3571,7 @@
                 <w:szCs w:val="18"/>
                 <w:lang w:val="es-SV" w:eastAsia="en-US" w:bidi="ar-SA"/>
               </w:rPr>
-              <w:t xml:space="preserve">Verificación de que el registro de la digitalización se </w:t>
-            </w:r>
-            <w:r>
-              <w:rPr>
-                <w:rFonts w:eastAsia="Times New Roman" w:cs="Arial" w:ascii="Arial" w:hAnsi="Arial"/>
-                <w:b/>
-                <w:bCs/>
-                <w:color w:val="auto"/>
-                <w:kern w:val="0"/>
-                <w:sz w:val="18"/>
-                <w:szCs w:val="18"/>
-                <w:lang w:val="es-SV" w:eastAsia="en-US" w:bidi="ar-SA"/>
-              </w:rPr>
-              <w:t>encuentre creado  con el estatus CREATED</w:t>
-            </w:r>
-            <w:r>
-              <w:rPr>
-                <w:rFonts w:eastAsia="Times New Roman" w:cs="Arial" w:ascii="Arial" w:hAnsi="Arial"/>
-                <w:b/>
-                <w:bCs/>
-                <w:color w:val="auto"/>
-                <w:kern w:val="0"/>
-                <w:sz w:val="18"/>
-                <w:szCs w:val="18"/>
-                <w:lang w:val="es-SV" w:eastAsia="en-US" w:bidi="ar-SA"/>
-              </w:rPr>
-              <w:t xml:space="preserve"> en la tabla</w:t>
+              <w:t>Verificación de que el registro de la digitalización se encuentre creado  con el estatus CREATED en la tabla</w:t>
             </w:r>
             <w:r>
               <w:rPr>
@@ -4132,7 +3617,7 @@
               <w:pStyle w:val="Header"/>
               <w:widowControl/>
               <w:suppressAutoHyphens w:val="true"/>
-              <w:overflowPunct w:val="false"/>
+              <w:overflowPunct w:val="true"/>
               <w:bidi w:val="0"/>
               <w:spacing w:before="0" w:after="0"/>
               <w:jc w:val="left"/>
@@ -4166,7 +3651,7 @@
               <w:pStyle w:val="Header"/>
               <w:widowControl/>
               <w:suppressAutoHyphens w:val="true"/>
-              <w:overflowPunct w:val="false"/>
+              <w:overflowPunct w:val="true"/>
               <w:bidi w:val="0"/>
               <w:spacing w:before="0" w:after="0"/>
               <w:jc w:val="left"/>
@@ -4194,7 +3679,7 @@
                 <w:lang w:val="es-SV" w:eastAsia="en-US" w:bidi="ar-SA"/>
               </w:rPr>
               <w:drawing>
-                <wp:anchor behindDoc="0" distT="0" distB="0" distL="0" distR="0" simplePos="0" locked="0" layoutInCell="0" allowOverlap="1" relativeHeight="12">
+                <wp:anchor behindDoc="0" distT="0" distB="0" distL="0" distR="0" simplePos="0" locked="0" layoutInCell="0" allowOverlap="1" relativeHeight="18">
                   <wp:simplePos x="0" y="0"/>
                   <wp:positionH relativeFrom="column">
                     <wp:align>center</wp:align>
@@ -4245,7 +3730,7 @@
               <w:pStyle w:val="Header"/>
               <w:widowControl/>
               <w:suppressAutoHyphens w:val="true"/>
-              <w:overflowPunct w:val="false"/>
+              <w:overflowPunct w:val="true"/>
               <w:bidi w:val="0"/>
               <w:spacing w:before="0" w:after="0"/>
               <w:jc w:val="left"/>
@@ -4279,7 +3764,7 @@
               <w:pStyle w:val="Header"/>
               <w:widowControl/>
               <w:suppressAutoHyphens w:val="true"/>
-              <w:overflowPunct w:val="false"/>
+              <w:overflowPunct w:val="true"/>
               <w:bidi w:val="0"/>
               <w:spacing w:before="0" w:after="0"/>
               <w:jc w:val="left"/>
@@ -4314,10 +3799,10 @@
               <w:widowControl/>
               <w:numPr>
                 <w:ilvl w:val="0"/>
-                <w:numId w:val="3"/>
+                <w:numId w:val="2"/>
               </w:numPr>
               <w:suppressAutoHyphens w:val="true"/>
-              <w:overflowPunct w:val="false"/>
+              <w:overflowPunct w:val="true"/>
               <w:bidi w:val="0"/>
               <w:spacing w:before="0" w:after="0"/>
               <w:jc w:val="both"/>
@@ -4344,85 +3829,7 @@
                 <w:szCs w:val="18"/>
                 <w:lang w:val="es-SV" w:eastAsia="en-US" w:bidi="ar-SA"/>
               </w:rPr>
-              <w:t xml:space="preserve">Prueba de </w:t>
-            </w:r>
-            <w:r>
-              <w:rPr>
-                <w:rFonts w:eastAsia="Times New Roman" w:cs="Arial" w:ascii="Arial" w:hAnsi="Arial"/>
-                <w:b/>
-                <w:bCs/>
-                <w:color w:val="000000"/>
-                <w:kern w:val="0"/>
-                <w:sz w:val="18"/>
-                <w:szCs w:val="18"/>
-                <w:lang w:val="es-SV" w:eastAsia="en-US" w:bidi="ar-SA"/>
-              </w:rPr>
-              <w:t xml:space="preserve">Billetera </w:t>
-            </w:r>
-            <w:r>
-              <w:rPr>
-                <w:rFonts w:eastAsia="Times New Roman" w:cs="Arial" w:ascii="Arial" w:hAnsi="Arial"/>
-                <w:b/>
-                <w:bCs/>
-                <w:color w:val="000000"/>
-                <w:kern w:val="0"/>
-                <w:sz w:val="18"/>
-                <w:szCs w:val="18"/>
-                <w:lang w:val="es-SV" w:eastAsia="en-US" w:bidi="ar-SA"/>
-              </w:rPr>
-              <w:t>Apple</w:t>
-            </w:r>
-            <w:r>
-              <w:rPr>
-                <w:rFonts w:eastAsia="Times New Roman" w:cs="Arial" w:ascii="Arial" w:hAnsi="Arial"/>
-                <w:b/>
-                <w:bCs/>
-                <w:color w:val="000000"/>
-                <w:kern w:val="0"/>
-                <w:sz w:val="18"/>
-                <w:szCs w:val="18"/>
-                <w:lang w:val="es-SV" w:eastAsia="en-US" w:bidi="ar-SA"/>
-              </w:rPr>
-              <w:t>Pay - 50110030273</w:t>
-            </w:r>
-            <w:r>
-              <w:rPr>
-                <w:rFonts w:eastAsia="Times New Roman" w:cs="Arial" w:ascii="Arial" w:hAnsi="Arial"/>
-                <w:b/>
-                <w:bCs/>
-                <w:color w:val="000000"/>
-                <w:kern w:val="0"/>
-                <w:sz w:val="18"/>
-                <w:szCs w:val="18"/>
-                <w:lang w:val="es-SV" w:eastAsia="en-US" w:bidi="ar-SA"/>
-              </w:rPr>
-              <w:t xml:space="preserve">) con tokenRefId de </w:t>
-            </w:r>
-            <w:r>
-              <w:rPr>
-                <w:rFonts w:eastAsia="Times New Roman" w:cs="Arial" w:ascii="Arial" w:hAnsi="Arial"/>
-                <w:b/>
-                <w:bCs/>
-                <w:color w:val="000000"/>
-                <w:kern w:val="0"/>
-                <w:sz w:val="18"/>
-                <w:szCs w:val="18"/>
-                <w:lang w:val="es-SV" w:eastAsia="en-US" w:bidi="ar-SA"/>
-              </w:rPr>
-              <w:t>VISA</w:t>
-            </w:r>
-            <w:r>
-              <w:rPr>
-                <w:rFonts w:eastAsia="Times New Roman" w:cs="Arial" w:ascii="Arial" w:hAnsi="Arial"/>
-                <w:b/>
-                <w:bCs/>
-                <w:color w:val="000000"/>
-                <w:kern w:val="0"/>
-                <w:sz w:val="18"/>
-                <w:szCs w:val="18"/>
-                <w:lang w:val="es-SV" w:eastAsia="en-US" w:bidi="ar-SA"/>
-              </w:rPr>
-              <w:t>:</w:t>
+              <w:t>Prueba de Billetera ApplePay - 50110030273) con tokenRefId de VISA:</w:t>
             </w:r>
           </w:p>
           <w:p>
@@ -4430,7 +3837,7 @@
               <w:pStyle w:val="Header"/>
               <w:widowControl/>
               <w:suppressAutoHyphens w:val="true"/>
-              <w:overflowPunct w:val="false"/>
+              <w:overflowPunct w:val="true"/>
               <w:bidi w:val="0"/>
               <w:spacing w:before="0" w:after="0"/>
               <w:jc w:val="left"/>
@@ -4464,7 +3871,7 @@
               <w:pStyle w:val="Header"/>
               <w:widowControl/>
               <w:suppressAutoHyphens w:val="true"/>
-              <w:overflowPunct w:val="false"/>
+              <w:overflowPunct w:val="true"/>
               <w:bidi w:val="0"/>
               <w:spacing w:before="0" w:after="0"/>
               <w:jc w:val="left"/>
@@ -4492,7 +3899,7 @@
                 <w:lang w:val="es-SV" w:eastAsia="en-US" w:bidi="ar-SA"/>
               </w:rPr>
               <w:drawing>
-                <wp:anchor behindDoc="0" distT="0" distB="0" distL="0" distR="0" simplePos="0" locked="0" layoutInCell="0" allowOverlap="1" relativeHeight="15">
+                <wp:anchor behindDoc="0" distT="0" distB="0" distL="0" distR="0" simplePos="0" locked="0" layoutInCell="0" allowOverlap="1" relativeHeight="21">
                   <wp:simplePos x="0" y="0"/>
                   <wp:positionH relativeFrom="column">
                     <wp:align>center</wp:align>
@@ -4543,7 +3950,7 @@
               <w:pStyle w:val="Header"/>
               <w:widowControl/>
               <w:suppressAutoHyphens w:val="true"/>
-              <w:overflowPunct w:val="false"/>
+              <w:overflowPunct w:val="true"/>
               <w:bidi w:val="0"/>
               <w:spacing w:before="0" w:after="0"/>
               <w:jc w:val="left"/>
@@ -4568,7 +3975,7 @@
                 <w:kern w:val="0"/>
                 <w:sz w:val="18"/>
                 <w:szCs w:val="18"/>
-                <w:lang w:bidi="ar-SA"/>
+                <w:lang w:val="es-SV" w:eastAsia="en-US" w:bidi="ar-SA"/>
               </w:rPr>
             </w:r>
           </w:p>
@@ -4578,10 +3985,10 @@
               <w:widowControl/>
               <w:numPr>
                 <w:ilvl w:val="0"/>
-                <w:numId w:val="4"/>
+                <w:numId w:val="3"/>
               </w:numPr>
               <w:suppressAutoHyphens w:val="true"/>
-              <w:overflowPunct w:val="false"/>
+              <w:overflowPunct w:val="true"/>
               <w:bidi w:val="0"/>
               <w:spacing w:before="0" w:after="0"/>
               <w:jc w:val="both"/>
@@ -4608,46 +4015,7 @@
                 <w:szCs w:val="18"/>
                 <w:lang w:val="es-SV" w:eastAsia="en-US" w:bidi="ar-SA"/>
               </w:rPr>
-              <w:t>Response</w:t>
-            </w:r>
-            <w:r>
-              <w:rPr>
-                <w:rFonts w:eastAsia="Times New Roman" w:cs="Arial" w:ascii="Arial" w:hAnsi="Arial"/>
-                <w:b/>
-                <w:bCs/>
-                <w:color w:val="000000"/>
-                <w:kern w:val="0"/>
-                <w:sz w:val="18"/>
-                <w:szCs w:val="18"/>
-                <w:lang w:val="es-SV" w:eastAsia="en-US" w:bidi="ar-SA"/>
-              </w:rPr>
-              <w:t xml:space="preserve"> </w:t>
-            </w:r>
-            <w:r>
-              <w:rPr>
-                <w:rFonts w:eastAsia="Times New Roman" w:cs="Arial" w:ascii="Arial" w:hAnsi="Arial"/>
-                <w:b/>
-                <w:bCs/>
-                <w:color w:val="000000"/>
-                <w:kern w:val="0"/>
-                <w:sz w:val="18"/>
-                <w:szCs w:val="18"/>
-                <w:lang w:val="es-SV" w:eastAsia="en-US" w:bidi="ar-SA"/>
-              </w:rPr>
-              <w:t>del api (00)</w:t>
-            </w:r>
-            <w:r>
-              <w:rPr>
-                <w:rFonts w:eastAsia="Times New Roman" w:cs="Arial" w:ascii="Arial" w:hAnsi="Arial"/>
-                <w:b/>
-                <w:bCs/>
-                <w:color w:val="000000"/>
-                <w:kern w:val="0"/>
-                <w:sz w:val="18"/>
-                <w:szCs w:val="18"/>
-                <w:lang w:val="es-SV" w:eastAsia="en-US" w:bidi="ar-SA"/>
-              </w:rPr>
-              <w:t>:</w:t>
+              <w:t>Response del api (00):</w:t>
             </w:r>
           </w:p>
           <w:p>
@@ -4655,7 +4023,7 @@
               <w:pStyle w:val="Header"/>
               <w:widowControl/>
               <w:suppressAutoHyphens w:val="true"/>
-              <w:overflowPunct w:val="false"/>
+              <w:overflowPunct w:val="true"/>
               <w:bidi w:val="0"/>
               <w:spacing w:before="0" w:after="0"/>
               <w:jc w:val="left"/>
@@ -4689,7 +4057,7 @@
               <w:pStyle w:val="Header"/>
               <w:widowControl/>
               <w:suppressAutoHyphens w:val="true"/>
-              <w:overflowPunct w:val="false"/>
+              <w:overflowPunct w:val="true"/>
               <w:bidi w:val="0"/>
               <w:spacing w:before="0" w:after="0"/>
               <w:jc w:val="left"/>
@@ -4717,7 +4085,7 @@
                 <w:lang w:val="es-SV" w:eastAsia="en-US" w:bidi="ar-SA"/>
               </w:rPr>
               <w:drawing>
-                <wp:anchor behindDoc="0" distT="0" distB="0" distL="0" distR="0" simplePos="0" locked="0" layoutInCell="0" allowOverlap="1" relativeHeight="17">
+                <wp:anchor behindDoc="0" distT="0" distB="0" distL="0" distR="0" simplePos="0" locked="0" layoutInCell="0" allowOverlap="1" relativeHeight="23">
                   <wp:simplePos x="0" y="0"/>
                   <wp:positionH relativeFrom="column">
                     <wp:align>center</wp:align>
@@ -4768,7 +4136,7 @@
               <w:pStyle w:val="Header"/>
               <w:widowControl/>
               <w:suppressAutoHyphens w:val="true"/>
-              <w:overflowPunct w:val="false"/>
+              <w:overflowPunct w:val="true"/>
               <w:bidi w:val="0"/>
               <w:spacing w:before="0" w:after="0"/>
               <w:jc w:val="left"/>
@@ -4803,10 +4171,10 @@
               <w:widowControl/>
               <w:numPr>
                 <w:ilvl w:val="0"/>
-                <w:numId w:val="4"/>
+                <w:numId w:val="3"/>
               </w:numPr>
               <w:suppressAutoHyphens w:val="true"/>
-              <w:overflowPunct w:val="false"/>
+              <w:overflowPunct w:val="true"/>
               <w:bidi w:val="0"/>
               <w:spacing w:before="0" w:after="0"/>
               <w:jc w:val="both"/>
@@ -4824,33 +4192,7 @@
                 <w:szCs w:val="18"/>
                 <w:lang w:val="es-SV" w:eastAsia="en-US" w:bidi="ar-SA"/>
               </w:rPr>
-              <w:t xml:space="preserve">Verificación de que el registro de la digitalización se </w:t>
-            </w:r>
-            <w:r>
-              <w:rPr>
-                <w:rFonts w:eastAsia="Times New Roman" w:cs="Arial" w:ascii="Arial" w:hAnsi="Arial"/>
-                <w:b/>
-                <w:bCs/>
-                <w:color w:val="auto"/>
-                <w:kern w:val="0"/>
-                <w:sz w:val="18"/>
-                <w:szCs w:val="18"/>
-                <w:lang w:val="es-SV" w:eastAsia="en-US" w:bidi="ar-SA"/>
-              </w:rPr>
-              <w:t>encuentre creado  con el estatus CREATED</w:t>
-            </w:r>
-            <w:r>
-              <w:rPr>
-                <w:rFonts w:eastAsia="Times New Roman" w:cs="Arial" w:ascii="Arial" w:hAnsi="Arial"/>
-                <w:b/>
-                <w:bCs/>
-                <w:color w:val="auto"/>
-                <w:kern w:val="0"/>
-                <w:sz w:val="18"/>
-                <w:szCs w:val="18"/>
-                <w:lang w:val="es-SV" w:eastAsia="en-US" w:bidi="ar-SA"/>
-              </w:rPr>
-              <w:t xml:space="preserve"> en la tabla</w:t>
+              <w:t>Verificación de que el registro de la digitalización se encuentre creado  con el estatus CREATED en la tabla</w:t>
             </w:r>
             <w:r>
               <w:rPr>
@@ -4896,7 +4238,7 @@
               <w:pStyle w:val="Header"/>
               <w:widowControl/>
               <w:suppressAutoHyphens w:val="true"/>
-              <w:overflowPunct w:val="false"/>
+              <w:overflowPunct w:val="true"/>
               <w:bidi w:val="0"/>
               <w:spacing w:before="0" w:after="0"/>
               <w:jc w:val="left"/>
@@ -4930,7 +4272,7 @@
               <w:pStyle w:val="Header"/>
               <w:widowControl/>
               <w:suppressAutoHyphens w:val="true"/>
-              <w:overflowPunct w:val="false"/>
+              <w:overflowPunct w:val="true"/>
               <w:bidi w:val="0"/>
               <w:spacing w:before="0" w:after="0"/>
               <w:jc w:val="left"/>
@@ -4958,7 +4300,7 @@
                 <w:lang w:val="es-SV" w:eastAsia="en-US" w:bidi="ar-SA"/>
               </w:rPr>
               <w:drawing>
-                <wp:anchor behindDoc="0" distT="0" distB="0" distL="0" distR="0" simplePos="0" locked="0" layoutInCell="0" allowOverlap="1" relativeHeight="7">
+                <wp:anchor behindDoc="0" distT="0" distB="0" distL="0" distR="0" simplePos="0" locked="0" layoutInCell="0" allowOverlap="1" relativeHeight="13">
                   <wp:simplePos x="0" y="0"/>
                   <wp:positionH relativeFrom="column">
                     <wp:align>center</wp:align>
@@ -5009,7 +4351,7 @@
               <w:pStyle w:val="Header"/>
               <w:widowControl/>
               <w:suppressAutoHyphens w:val="true"/>
-              <w:overflowPunct w:val="false"/>
+              <w:overflowPunct w:val="true"/>
               <w:bidi w:val="0"/>
               <w:spacing w:before="0" w:after="0"/>
               <w:jc w:val="left"/>
@@ -5067,20 +4409,7 @@
                 <w:szCs w:val="20"/>
                 <w:lang w:bidi="ar-SA"/>
               </w:rPr>
-              <w:t>-: Api LifeCycleNotification</w:t>
-            </w:r>
-            <w:r>
-              <w:rPr>
-                <w:rFonts w:eastAsia="Times New Roman" w:cs="Arial" w:ascii="Georgia" w:hAnsi="Georgia"/>
-                <w:b/>
-                <w:bCs/>
-                <w:color w:val="000000"/>
-                <w:kern w:val="0"/>
-                <w:sz w:val="20"/>
-                <w:szCs w:val="20"/>
-                <w:lang w:bidi="ar-SA"/>
-              </w:rPr>
-              <w:t xml:space="preserve"> :-</w:t>
+              <w:t>-: Api LifeCycleNotification :-</w:t>
             </w:r>
           </w:p>
           <w:p>
@@ -5118,10 +4447,10 @@
               <w:widowControl/>
               <w:numPr>
                 <w:ilvl w:val="0"/>
-                <w:numId w:val="4"/>
+                <w:numId w:val="3"/>
               </w:numPr>
               <w:suppressAutoHyphens w:val="true"/>
-              <w:overflowPunct w:val="false"/>
+              <w:overflowPunct w:val="true"/>
               <w:bidi w:val="0"/>
               <w:spacing w:before="0" w:after="0"/>
               <w:jc w:val="both"/>
@@ -5147,7 +4476,7 @@
               <w:pStyle w:val="Header"/>
               <w:widowControl/>
               <w:suppressAutoHyphens w:val="true"/>
-              <w:overflowPunct w:val="false"/>
+              <w:overflowPunct w:val="true"/>
               <w:bidi w:val="0"/>
               <w:spacing w:before="0" w:after="0"/>
               <w:jc w:val="both"/>
@@ -5164,7 +4493,16 @@
               </w:rPr>
             </w:pPr>
             <w:r>
-              <w:rPr/>
+              <w:rPr>
+                <w:rFonts w:eastAsia="Times New Roman" w:cs="Arial" w:ascii="Arial" w:hAnsi="Arial"/>
+                <w:b/>
+                <w:bCs/>
+                <w:color w:val="000000"/>
+                <w:kern w:val="0"/>
+                <w:sz w:val="18"/>
+                <w:szCs w:val="18"/>
+                <w:lang w:val="es-SV" w:eastAsia="en-US" w:bidi="ar-SA"/>
+              </w:rPr>
             </w:r>
           </w:p>
           <w:p>
@@ -5173,10 +4511,10 @@
               <w:widowControl/>
               <w:numPr>
                 <w:ilvl w:val="1"/>
-                <w:numId w:val="4"/>
+                <w:numId w:val="3"/>
               </w:numPr>
               <w:suppressAutoHyphens w:val="true"/>
-              <w:overflowPunct w:val="false"/>
+              <w:overflowPunct w:val="true"/>
               <w:bidi w:val="0"/>
               <w:spacing w:before="0" w:after="0"/>
               <w:jc w:val="both"/>
@@ -5212,10 +4550,10 @@
               <w:widowControl/>
               <w:numPr>
                 <w:ilvl w:val="1"/>
-                <w:numId w:val="4"/>
+                <w:numId w:val="3"/>
               </w:numPr>
               <w:suppressAutoHyphens w:val="true"/>
-              <w:overflowPunct w:val="false"/>
+              <w:overflowPunct w:val="true"/>
               <w:bidi w:val="0"/>
               <w:spacing w:before="0" w:after="0"/>
               <w:jc w:val="both"/>
@@ -5250,7 +4588,7 @@
               <w:pStyle w:val="Header"/>
               <w:widowControl/>
               <w:suppressAutoHyphens w:val="true"/>
-              <w:overflowPunct w:val="false"/>
+              <w:overflowPunct w:val="true"/>
               <w:bidi w:val="0"/>
               <w:spacing w:before="0" w:after="0"/>
               <w:jc w:val="both"/>
@@ -5284,7 +4622,7 @@
               <w:pStyle w:val="Header"/>
               <w:widowControl/>
               <w:suppressAutoHyphens w:val="true"/>
-              <w:overflowPunct w:val="false"/>
+              <w:overflowPunct w:val="true"/>
               <w:bidi w:val="0"/>
               <w:spacing w:before="0" w:after="0"/>
               <w:jc w:val="both"/>
@@ -5319,10 +4657,10 @@
               <w:widowControl/>
               <w:numPr>
                 <w:ilvl w:val="0"/>
-                <w:numId w:val="4"/>
+                <w:numId w:val="3"/>
               </w:numPr>
               <w:suppressAutoHyphens w:val="true"/>
-              <w:overflowPunct w:val="false"/>
+              <w:overflowPunct w:val="true"/>
               <w:bidi w:val="0"/>
               <w:spacing w:before="0" w:after="0"/>
               <w:jc w:val="both"/>
@@ -5349,72 +4687,7 @@
                 <w:szCs w:val="18"/>
                 <w:lang w:val="es-SV" w:eastAsia="en-US" w:bidi="ar-SA"/>
               </w:rPr>
-              <w:t xml:space="preserve">Prueba de </w:t>
-            </w:r>
-            <w:r>
-              <w:rPr>
-                <w:rFonts w:eastAsia="Times New Roman" w:cs="Arial" w:ascii="Arial" w:hAnsi="Arial"/>
-                <w:b/>
-                <w:bCs/>
-                <w:color w:val="000000"/>
-                <w:kern w:val="0"/>
-                <w:sz w:val="18"/>
-                <w:szCs w:val="18"/>
-                <w:lang w:val="es-SV" w:eastAsia="en-US" w:bidi="ar-SA"/>
-              </w:rPr>
-              <w:t xml:space="preserve">Billetera </w:t>
-            </w:r>
-            <w:r>
-              <w:rPr>
-                <w:rFonts w:eastAsia="Times New Roman" w:cs="Arial" w:ascii="Arial" w:hAnsi="Arial"/>
-                <w:b/>
-                <w:bCs/>
-                <w:color w:val="000000"/>
-                <w:kern w:val="0"/>
-                <w:sz w:val="18"/>
-                <w:szCs w:val="18"/>
-                <w:lang w:val="es-SV" w:eastAsia="en-US" w:bidi="ar-SA"/>
-              </w:rPr>
-              <w:t xml:space="preserve">ApplePay - </w:t>
-            </w:r>
-            <w:r>
-              <w:rPr>
-                <w:rFonts w:eastAsia="Times New Roman" w:cs="Arial" w:ascii="Arial" w:hAnsi="Arial"/>
-                <w:b/>
-                <w:bCs/>
-                <w:color w:val="000000"/>
-                <w:kern w:val="0"/>
-                <w:sz w:val="18"/>
-                <w:szCs w:val="18"/>
-                <w:lang w:val="es-SV" w:eastAsia="en-US" w:bidi="ar-SA"/>
-              </w:rPr>
-              <w:t>50110030273</w:t>
-            </w:r>
-            <w:r>
-              <w:rPr>
-                <w:rFonts w:eastAsia="Times New Roman" w:cs="Arial" w:ascii="Arial" w:hAnsi="Arial"/>
-                <w:b/>
-                <w:bCs/>
-                <w:color w:val="000000"/>
-                <w:kern w:val="0"/>
-                <w:sz w:val="18"/>
-                <w:szCs w:val="18"/>
-                <w:lang w:val="es-SV" w:eastAsia="en-US" w:bidi="ar-SA"/>
-              </w:rPr>
-              <w:t>) con tokenRefId de MasterCard</w:t>
-            </w:r>
-            <w:r>
-              <w:rPr>
-                <w:rFonts w:eastAsia="Times New Roman" w:cs="Arial" w:ascii="Arial" w:hAnsi="Arial"/>
-                <w:b/>
-                <w:bCs/>
-                <w:color w:val="000000"/>
-                <w:kern w:val="0"/>
-                <w:sz w:val="18"/>
-                <w:szCs w:val="18"/>
-                <w:lang w:val="es-SV" w:eastAsia="en-US" w:bidi="ar-SA"/>
-              </w:rPr>
-              <w:t>:</w:t>
+              <w:t>Prueba de Billetera ApplePay - 50110030273) con tokenRefId de MasterCard:</w:t>
             </w:r>
           </w:p>
           <w:p>
@@ -5422,7 +4695,7 @@
               <w:pStyle w:val="Header"/>
               <w:widowControl/>
               <w:suppressAutoHyphens w:val="true"/>
-              <w:overflowPunct w:val="false"/>
+              <w:overflowPunct w:val="true"/>
               <w:bidi w:val="0"/>
               <w:spacing w:before="0" w:after="0"/>
               <w:jc w:val="both"/>
@@ -5456,7 +4729,7 @@
               <w:pStyle w:val="Header"/>
               <w:widowControl/>
               <w:suppressAutoHyphens w:val="true"/>
-              <w:overflowPunct w:val="false"/>
+              <w:overflowPunct w:val="true"/>
               <w:bidi w:val="0"/>
               <w:spacing w:before="0" w:after="0"/>
               <w:jc w:val="both"/>
@@ -5484,7 +4757,7 @@
                 <w:lang w:val="es-SV" w:eastAsia="en-US" w:bidi="ar-SA"/>
               </w:rPr>
               <w:drawing>
-                <wp:anchor behindDoc="0" distT="0" distB="0" distL="0" distR="0" simplePos="0" locked="0" layoutInCell="0" allowOverlap="1" relativeHeight="9">
+                <wp:anchor behindDoc="0" distT="0" distB="0" distL="0" distR="0" simplePos="0" locked="0" layoutInCell="0" allowOverlap="1" relativeHeight="15">
                   <wp:simplePos x="0" y="0"/>
                   <wp:positionH relativeFrom="column">
                     <wp:align>center</wp:align>
@@ -5535,7 +4808,7 @@
               <w:pStyle w:val="Header"/>
               <w:widowControl/>
               <w:suppressAutoHyphens w:val="true"/>
-              <w:overflowPunct w:val="false"/>
+              <w:overflowPunct w:val="true"/>
               <w:bidi w:val="0"/>
               <w:spacing w:before="0" w:after="0"/>
               <w:jc w:val="both"/>
@@ -5570,10 +4843,10 @@
               <w:widowControl/>
               <w:numPr>
                 <w:ilvl w:val="0"/>
-                <w:numId w:val="4"/>
+                <w:numId w:val="3"/>
               </w:numPr>
               <w:suppressAutoHyphens w:val="true"/>
-              <w:overflowPunct w:val="false"/>
+              <w:overflowPunct w:val="true"/>
               <w:bidi w:val="0"/>
               <w:spacing w:before="0" w:after="0"/>
               <w:jc w:val="both"/>
@@ -5600,46 +4873,7 @@
                 <w:szCs w:val="18"/>
                 <w:lang w:val="es-SV" w:eastAsia="en-US" w:bidi="ar-SA"/>
               </w:rPr>
-              <w:t>Response</w:t>
-            </w:r>
-            <w:r>
-              <w:rPr>
-                <w:rFonts w:eastAsia="Times New Roman" w:cs="Arial" w:ascii="Arial" w:hAnsi="Arial"/>
-                <w:b/>
-                <w:bCs/>
-                <w:color w:val="000000"/>
-                <w:kern w:val="0"/>
-                <w:sz w:val="18"/>
-                <w:szCs w:val="18"/>
-                <w:lang w:val="es-SV" w:eastAsia="en-US" w:bidi="ar-SA"/>
-              </w:rPr>
-              <w:t xml:space="preserve"> </w:t>
-            </w:r>
-            <w:r>
-              <w:rPr>
-                <w:rFonts w:eastAsia="Times New Roman" w:cs="Arial" w:ascii="Arial" w:hAnsi="Arial"/>
-                <w:b/>
-                <w:bCs/>
-                <w:color w:val="000000"/>
-                <w:kern w:val="0"/>
-                <w:sz w:val="18"/>
-                <w:szCs w:val="18"/>
-                <w:lang w:val="es-SV" w:eastAsia="en-US" w:bidi="ar-SA"/>
-              </w:rPr>
-              <w:t>del api (00)</w:t>
-            </w:r>
-            <w:r>
-              <w:rPr>
-                <w:rFonts w:eastAsia="Times New Roman" w:cs="Arial" w:ascii="Arial" w:hAnsi="Arial"/>
-                <w:b/>
-                <w:bCs/>
-                <w:color w:val="000000"/>
-                <w:kern w:val="0"/>
-                <w:sz w:val="18"/>
-                <w:szCs w:val="18"/>
-                <w:lang w:val="es-SV" w:eastAsia="en-US" w:bidi="ar-SA"/>
-              </w:rPr>
-              <w:t>:</w:t>
+              <w:t>Response del api (00):</w:t>
             </w:r>
           </w:p>
           <w:p>
@@ -5647,7 +4881,7 @@
               <w:pStyle w:val="Header"/>
               <w:widowControl/>
               <w:suppressAutoHyphens w:val="true"/>
-              <w:overflowPunct w:val="false"/>
+              <w:overflowPunct w:val="true"/>
               <w:bidi w:val="0"/>
               <w:spacing w:before="0" w:after="0"/>
               <w:jc w:val="both"/>
@@ -5681,7 +4915,7 @@
               <w:pStyle w:val="Header"/>
               <w:widowControl/>
               <w:suppressAutoHyphens w:val="true"/>
-              <w:overflowPunct w:val="false"/>
+              <w:overflowPunct w:val="true"/>
               <w:bidi w:val="0"/>
               <w:spacing w:before="0" w:after="0"/>
               <w:jc w:val="both"/>
@@ -5709,7 +4943,7 @@
                 <w:lang w:val="es-SV" w:eastAsia="en-US" w:bidi="ar-SA"/>
               </w:rPr>
               <w:drawing>
-                <wp:anchor behindDoc="0" distT="0" distB="0" distL="0" distR="0" simplePos="0" locked="0" layoutInCell="0" allowOverlap="1" relativeHeight="8">
+                <wp:anchor behindDoc="0" distT="0" distB="0" distL="0" distR="0" simplePos="0" locked="0" layoutInCell="0" allowOverlap="1" relativeHeight="14">
                   <wp:simplePos x="0" y="0"/>
                   <wp:positionH relativeFrom="column">
                     <wp:align>center</wp:align>
@@ -5760,7 +4994,7 @@
               <w:pStyle w:val="Header"/>
               <w:widowControl/>
               <w:suppressAutoHyphens w:val="true"/>
-              <w:overflowPunct w:val="false"/>
+              <w:overflowPunct w:val="true"/>
               <w:bidi w:val="0"/>
               <w:spacing w:before="0" w:after="0"/>
               <w:jc w:val="both"/>
@@ -5795,10 +5029,10 @@
               <w:widowControl/>
               <w:numPr>
                 <w:ilvl w:val="0"/>
-                <w:numId w:val="4"/>
+                <w:numId w:val="3"/>
               </w:numPr>
               <w:suppressAutoHyphens w:val="true"/>
-              <w:overflowPunct w:val="false"/>
+              <w:overflowPunct w:val="true"/>
               <w:bidi w:val="0"/>
               <w:spacing w:before="0" w:after="0"/>
               <w:jc w:val="both"/>
@@ -5816,33 +5050,7 @@
                 <w:szCs w:val="18"/>
                 <w:lang w:val="es-SV" w:eastAsia="en-US" w:bidi="ar-SA"/>
               </w:rPr>
-              <w:t xml:space="preserve">Verificación de que el registro de la digitalización se encuentre creado  con el estatus </w:t>
-            </w:r>
-            <w:r>
-              <w:rPr>
-                <w:rFonts w:eastAsia="Times New Roman" w:cs="Arial" w:ascii="Arial" w:hAnsi="Arial"/>
-                <w:b/>
-                <w:bCs/>
-                <w:color w:val="000000"/>
-                <w:kern w:val="0"/>
-                <w:sz w:val="18"/>
-                <w:szCs w:val="18"/>
-                <w:lang w:val="es-SV" w:eastAsia="en-US" w:bidi="ar-SA"/>
-              </w:rPr>
-              <w:t>ACTIVATED</w:t>
-            </w:r>
-            <w:r>
-              <w:rPr>
-                <w:rFonts w:eastAsia="Times New Roman" w:cs="Arial" w:ascii="Arial" w:hAnsi="Arial"/>
-                <w:b/>
-                <w:bCs/>
-                <w:color w:val="000000"/>
-                <w:kern w:val="0"/>
-                <w:sz w:val="18"/>
-                <w:szCs w:val="18"/>
-                <w:lang w:val="es-SV" w:eastAsia="en-US" w:bidi="ar-SA"/>
-              </w:rPr>
-              <w:t xml:space="preserve"> en la tabla</w:t>
+              <w:t>Verificación de que el registro de la digitalización se encuentre creado  con el estatus ACTIVATED en la tabla</w:t>
             </w:r>
             <w:r>
               <w:rPr/>
@@ -5868,7 +5076,7 @@
               <w:pStyle w:val="Header"/>
               <w:widowControl/>
               <w:suppressAutoHyphens w:val="true"/>
-              <w:overflowPunct w:val="false"/>
+              <w:overflowPunct w:val="true"/>
               <w:bidi w:val="0"/>
               <w:spacing w:before="0" w:after="0"/>
               <w:jc w:val="both"/>
@@ -5902,7 +5110,7 @@
               <w:pStyle w:val="Header"/>
               <w:widowControl/>
               <w:suppressAutoHyphens w:val="true"/>
-              <w:overflowPunct w:val="false"/>
+              <w:overflowPunct w:val="true"/>
               <w:bidi w:val="0"/>
               <w:spacing w:before="0" w:after="0"/>
               <w:jc w:val="both"/>
@@ -5936,7 +5144,7 @@
               <w:pStyle w:val="Header"/>
               <w:widowControl/>
               <w:suppressAutoHyphens w:val="true"/>
-              <w:overflowPunct w:val="false"/>
+              <w:overflowPunct w:val="true"/>
               <w:bidi w:val="0"/>
               <w:spacing w:before="0" w:after="0"/>
               <w:jc w:val="both"/>
@@ -5964,7 +5172,7 @@
                 <w:lang w:val="es-SV" w:eastAsia="en-US" w:bidi="ar-SA"/>
               </w:rPr>
               <w:drawing>
-                <wp:anchor behindDoc="0" distT="0" distB="0" distL="0" distR="0" simplePos="0" locked="0" layoutInCell="0" allowOverlap="1" relativeHeight="5">
+                <wp:anchor behindDoc="0" distT="0" distB="0" distL="0" distR="0" simplePos="0" locked="0" layoutInCell="0" allowOverlap="1" relativeHeight="11">
                   <wp:simplePos x="0" y="0"/>
                   <wp:positionH relativeFrom="column">
                     <wp:align>center</wp:align>
@@ -6015,7 +5223,7 @@
               <w:pStyle w:val="Header"/>
               <w:widowControl/>
               <w:suppressAutoHyphens w:val="true"/>
-              <w:overflowPunct w:val="false"/>
+              <w:overflowPunct w:val="true"/>
               <w:bidi w:val="0"/>
               <w:spacing w:before="0" w:after="0"/>
               <w:jc w:val="both"/>
@@ -6050,10 +5258,10 @@
               <w:widowControl/>
               <w:numPr>
                 <w:ilvl w:val="0"/>
-                <w:numId w:val="4"/>
+                <w:numId w:val="3"/>
               </w:numPr>
               <w:suppressAutoHyphens w:val="true"/>
-              <w:overflowPunct w:val="false"/>
+              <w:overflowPunct w:val="true"/>
               <w:bidi w:val="0"/>
               <w:spacing w:before="0" w:after="0"/>
               <w:jc w:val="both"/>
@@ -6088,7 +5296,7 @@
               <w:pStyle w:val="Header"/>
               <w:widowControl/>
               <w:suppressAutoHyphens w:val="true"/>
-              <w:overflowPunct w:val="false"/>
+              <w:overflowPunct w:val="true"/>
               <w:bidi w:val="0"/>
               <w:spacing w:before="0" w:after="0"/>
               <w:jc w:val="both"/>
@@ -6115,6 +5323,51 @@
                 <w:szCs w:val="18"/>
                 <w:lang w:val="es-SV" w:eastAsia="en-US" w:bidi="ar-SA"/>
               </w:rPr>
+              <w:drawing>
+                <wp:anchor behindDoc="0" distT="0" distB="0" distL="0" distR="0" simplePos="0" locked="0" layoutInCell="0" allowOverlap="1" relativeHeight="29">
+                  <wp:simplePos x="0" y="0"/>
+                  <wp:positionH relativeFrom="column">
+                    <wp:align>center</wp:align>
+                  </wp:positionH>
+                  <wp:positionV relativeFrom="paragraph">
+                    <wp:posOffset>635</wp:posOffset>
+                  </wp:positionV>
+                  <wp:extent cx="3535680" cy="3792220"/>
+                  <wp:effectExtent l="0" t="0" r="0" b="0"/>
+                  <wp:wrapSquare wrapText="largest"/>
+                  <wp:docPr id="16" name="Imagen19" descr=""/>
+                  <wp:cNvGraphicFramePr>
+                    <a:graphicFrameLocks xmlns:a="http://schemas.openxmlformats.org/drawingml/2006/main" noChangeAspect="1"/>
+                  </wp:cNvGraphicFramePr>
+                  <a:graphic xmlns:a="http://schemas.openxmlformats.org/drawingml/2006/main">
+                    <a:graphicData uri="http://schemas.openxmlformats.org/drawingml/2006/picture">
+                      <pic:pic xmlns:pic="http://schemas.openxmlformats.org/drawingml/2006/picture">
+                        <pic:nvPicPr>
+                          <pic:cNvPr id="16" name="Imagen19" descr=""/>
+                          <pic:cNvPicPr>
+                            <a:picLocks noChangeAspect="1" noChangeArrowheads="1"/>
+                          </pic:cNvPicPr>
+                        </pic:nvPicPr>
+                        <pic:blipFill>
+                          <a:blip r:embed="rId17"/>
+                          <a:stretch>
+                            <a:fillRect/>
+                          </a:stretch>
+                        </pic:blipFill>
+                        <pic:spPr bwMode="auto">
+                          <a:xfrm>
+                            <a:off x="0" y="0"/>
+                            <a:ext cx="3535680" cy="3792220"/>
+                          </a:xfrm>
+                          <a:prstGeom prst="rect">
+                            <a:avLst/>
+                          </a:prstGeom>
+                        </pic:spPr>
+                      </pic:pic>
+                    </a:graphicData>
+                  </a:graphic>
+                </wp:anchor>
+              </w:drawing>
             </w:r>
           </w:p>
           <w:p>
@@ -6122,7 +5375,7 @@
               <w:pStyle w:val="Header"/>
               <w:widowControl/>
               <w:suppressAutoHyphens w:val="true"/>
-              <w:overflowPunct w:val="false"/>
+              <w:overflowPunct w:val="true"/>
               <w:bidi w:val="0"/>
               <w:spacing w:before="0" w:after="0"/>
               <w:jc w:val="both"/>
@@ -6156,7 +5409,7 @@
               <w:pStyle w:val="Header"/>
               <w:widowControl/>
               <w:suppressAutoHyphens w:val="true"/>
-              <w:overflowPunct w:val="false"/>
+              <w:overflowPunct w:val="true"/>
               <w:bidi w:val="0"/>
               <w:spacing w:before="0" w:after="0"/>
               <w:jc w:val="both"/>
@@ -6190,7 +5443,7 @@
               <w:pStyle w:val="Header"/>
               <w:widowControl/>
               <w:suppressAutoHyphens w:val="true"/>
-              <w:overflowPunct w:val="false"/>
+              <w:overflowPunct w:val="true"/>
               <w:bidi w:val="0"/>
               <w:spacing w:before="0" w:after="0"/>
               <w:jc w:val="both"/>
@@ -6225,10 +5478,10 @@
               <w:widowControl/>
               <w:numPr>
                 <w:ilvl w:val="0"/>
-                <w:numId w:val="4"/>
+                <w:numId w:val="3"/>
               </w:numPr>
               <w:suppressAutoHyphens w:val="true"/>
-              <w:overflowPunct w:val="false"/>
+              <w:overflowPunct w:val="true"/>
               <w:bidi w:val="0"/>
               <w:spacing w:before="0" w:after="0"/>
               <w:jc w:val="both"/>
@@ -6255,72 +5508,7 @@
                 <w:szCs w:val="18"/>
                 <w:lang w:val="es-SV" w:eastAsia="en-US" w:bidi="ar-SA"/>
               </w:rPr>
-              <w:t xml:space="preserve">Prueba de </w:t>
-            </w:r>
-            <w:r>
-              <w:rPr>
-                <w:rFonts w:eastAsia="Times New Roman" w:cs="Arial" w:ascii="Arial" w:hAnsi="Arial"/>
-                <w:b/>
-                <w:bCs/>
-                <w:color w:val="000000"/>
-                <w:kern w:val="0"/>
-                <w:sz w:val="18"/>
-                <w:szCs w:val="18"/>
-                <w:lang w:val="es-SV" w:eastAsia="en-US" w:bidi="ar-SA"/>
-              </w:rPr>
-              <w:t xml:space="preserve">Billetera </w:t>
-            </w:r>
-            <w:r>
-              <w:rPr>
-                <w:rFonts w:eastAsia="Times New Roman" w:cs="Arial" w:ascii="Arial" w:hAnsi="Arial"/>
-                <w:b/>
-                <w:bCs/>
-                <w:color w:val="000000"/>
-                <w:kern w:val="0"/>
-                <w:sz w:val="18"/>
-                <w:szCs w:val="18"/>
-                <w:lang w:val="es-SV" w:eastAsia="en-US" w:bidi="ar-SA"/>
-              </w:rPr>
-              <w:t>GooglePay</w:t>
-            </w:r>
-            <w:r>
-              <w:rPr>
-                <w:rFonts w:eastAsia="Times New Roman" w:cs="Arial" w:ascii="Arial" w:hAnsi="Arial"/>
-                <w:b/>
-                <w:bCs/>
-                <w:color w:val="000000"/>
-                <w:kern w:val="0"/>
-                <w:sz w:val="18"/>
-                <w:szCs w:val="18"/>
-                <w:lang w:val="es-SV" w:eastAsia="en-US" w:bidi="ar-SA"/>
-              </w:rPr>
-              <w:t xml:space="preserve"> - 50120834693</w:t>
-            </w:r>
-            <w:r>
-              <w:rPr>
-                <w:rFonts w:eastAsia="Times New Roman" w:cs="Arial" w:ascii="Arial" w:hAnsi="Arial"/>
-                <w:b/>
-                <w:bCs/>
-                <w:color w:val="000000"/>
-                <w:kern w:val="0"/>
-                <w:sz w:val="18"/>
-                <w:szCs w:val="18"/>
-                <w:lang w:val="es-SV" w:eastAsia="en-US" w:bidi="ar-SA"/>
-              </w:rPr>
-              <w:t>) con tokenRefId de MasterCard</w:t>
-            </w:r>
-            <w:r>
-              <w:rPr>
-                <w:rFonts w:eastAsia="Times New Roman" w:cs="Arial" w:ascii="Arial" w:hAnsi="Arial"/>
-                <w:b/>
-                <w:bCs/>
-                <w:color w:val="000000"/>
-                <w:kern w:val="0"/>
-                <w:sz w:val="18"/>
-                <w:szCs w:val="18"/>
-                <w:lang w:val="es-SV" w:eastAsia="en-US" w:bidi="ar-SA"/>
-              </w:rPr>
-              <w:t>:</w:t>
+              <w:t>Prueba de Billetera GooglePay - 50120834693) con tokenRefId de MasterCard:</w:t>
             </w:r>
           </w:p>
           <w:p>
@@ -6328,7 +5516,7 @@
               <w:pStyle w:val="Header"/>
               <w:widowControl/>
               <w:suppressAutoHyphens w:val="true"/>
-              <w:overflowPunct w:val="false"/>
+              <w:overflowPunct w:val="true"/>
               <w:bidi w:val="0"/>
               <w:spacing w:before="0" w:after="0"/>
               <w:jc w:val="both"/>
@@ -6362,7 +5550,7 @@
               <w:pStyle w:val="Header"/>
               <w:widowControl/>
               <w:suppressAutoHyphens w:val="true"/>
-              <w:overflowPunct w:val="false"/>
+              <w:overflowPunct w:val="true"/>
               <w:bidi w:val="0"/>
               <w:spacing w:before="0" w:after="0"/>
               <w:jc w:val="both"/>
@@ -6390,7 +5578,7 @@
                 <w:lang w:val="es-SV" w:eastAsia="en-US" w:bidi="ar-SA"/>
               </w:rPr>
               <w:drawing>
-                <wp:anchor behindDoc="0" distT="0" distB="0" distL="0" distR="0" simplePos="0" locked="0" layoutInCell="0" allowOverlap="1" relativeHeight="13">
+                <wp:anchor behindDoc="0" distT="0" distB="0" distL="0" distR="0" simplePos="0" locked="0" layoutInCell="0" allowOverlap="1" relativeHeight="20">
                   <wp:simplePos x="0" y="0"/>
                   <wp:positionH relativeFrom="column">
                     <wp:align>center</wp:align>
@@ -6401,7 +5589,7 @@
                   <wp:extent cx="3536315" cy="2180590"/>
                   <wp:effectExtent l="0" t="0" r="0" b="0"/>
                   <wp:wrapSquare wrapText="largest"/>
-                  <wp:docPr id="16" name="Imagen17" descr=""/>
+                  <wp:docPr id="17" name="Imagen17" descr=""/>
                   <wp:cNvGraphicFramePr>
                     <a:graphicFrameLocks xmlns:a="http://schemas.openxmlformats.org/drawingml/2006/main" noChangeAspect="1"/>
                   </wp:cNvGraphicFramePr>
@@ -6409,13 +5597,13 @@
                     <a:graphicData uri="http://schemas.openxmlformats.org/drawingml/2006/picture">
                       <pic:pic xmlns:pic="http://schemas.openxmlformats.org/drawingml/2006/picture">
                         <pic:nvPicPr>
-                          <pic:cNvPr id="16" name="Imagen17" descr=""/>
+                          <pic:cNvPr id="17" name="Imagen17" descr=""/>
                           <pic:cNvPicPr>
                             <a:picLocks noChangeAspect="1" noChangeArrowheads="1"/>
                           </pic:cNvPicPr>
                         </pic:nvPicPr>
                         <pic:blipFill>
-                          <a:blip r:embed="rId17"/>
+                          <a:blip r:embed="rId18"/>
                           <a:stretch>
                             <a:fillRect/>
                           </a:stretch>
@@ -6441,7 +5629,7 @@
               <w:pStyle w:val="Header"/>
               <w:widowControl/>
               <w:suppressAutoHyphens w:val="true"/>
-              <w:overflowPunct w:val="false"/>
+              <w:overflowPunct w:val="true"/>
               <w:bidi w:val="0"/>
               <w:spacing w:before="0" w:after="0"/>
               <w:jc w:val="both"/>
@@ -6476,10 +5664,10 @@
               <w:widowControl/>
               <w:numPr>
                 <w:ilvl w:val="0"/>
-                <w:numId w:val="4"/>
+                <w:numId w:val="3"/>
               </w:numPr>
               <w:suppressAutoHyphens w:val="true"/>
-              <w:overflowPunct w:val="false"/>
+              <w:overflowPunct w:val="true"/>
               <w:bidi w:val="0"/>
               <w:spacing w:before="0" w:after="0"/>
               <w:jc w:val="both"/>
@@ -6506,46 +5694,7 @@
                 <w:szCs w:val="18"/>
                 <w:lang w:val="es-SV" w:eastAsia="en-US" w:bidi="ar-SA"/>
               </w:rPr>
-              <w:t>Response</w:t>
-            </w:r>
-            <w:r>
-              <w:rPr>
-                <w:rFonts w:eastAsia="Times New Roman" w:cs="Arial" w:ascii="Arial" w:hAnsi="Arial"/>
-                <w:b/>
-                <w:bCs/>
-                <w:color w:val="000000"/>
-                <w:kern w:val="0"/>
-                <w:sz w:val="18"/>
-                <w:szCs w:val="18"/>
-                <w:lang w:val="es-SV" w:eastAsia="en-US" w:bidi="ar-SA"/>
-              </w:rPr>
-              <w:t xml:space="preserve"> </w:t>
-            </w:r>
-            <w:r>
-              <w:rPr>
-                <w:rFonts w:eastAsia="Times New Roman" w:cs="Arial" w:ascii="Arial" w:hAnsi="Arial"/>
-                <w:b/>
-                <w:bCs/>
-                <w:color w:val="000000"/>
-                <w:kern w:val="0"/>
-                <w:sz w:val="18"/>
-                <w:szCs w:val="18"/>
-                <w:lang w:val="es-SV" w:eastAsia="en-US" w:bidi="ar-SA"/>
-              </w:rPr>
-              <w:t>del api (00)</w:t>
-            </w:r>
-            <w:r>
-              <w:rPr>
-                <w:rFonts w:eastAsia="Times New Roman" w:cs="Arial" w:ascii="Arial" w:hAnsi="Arial"/>
-                <w:b/>
-                <w:bCs/>
-                <w:color w:val="000000"/>
-                <w:kern w:val="0"/>
-                <w:sz w:val="18"/>
-                <w:szCs w:val="18"/>
-                <w:lang w:val="es-SV" w:eastAsia="en-US" w:bidi="ar-SA"/>
-              </w:rPr>
-              <w:t>:</w:t>
+              <w:t>Response del api (00):</w:t>
             </w:r>
           </w:p>
           <w:p>
@@ -6553,7 +5702,7 @@
               <w:pStyle w:val="Header"/>
               <w:widowControl/>
               <w:suppressAutoHyphens w:val="true"/>
-              <w:overflowPunct w:val="false"/>
+              <w:overflowPunct w:val="true"/>
               <w:bidi w:val="0"/>
               <w:spacing w:before="0" w:after="0"/>
               <w:jc w:val="both"/>
@@ -6587,7 +5736,7 @@
               <w:pStyle w:val="Header"/>
               <w:widowControl/>
               <w:suppressAutoHyphens w:val="true"/>
-              <w:overflowPunct w:val="false"/>
+              <w:overflowPunct w:val="true"/>
               <w:bidi w:val="0"/>
               <w:spacing w:before="0" w:after="0"/>
               <w:jc w:val="both"/>
@@ -6615,7 +5764,7 @@
                 <w:lang w:val="es-SV" w:eastAsia="en-US" w:bidi="ar-SA"/>
               </w:rPr>
               <w:drawing>
-                <wp:anchor behindDoc="0" distT="0" distB="0" distL="0" distR="0" simplePos="0" locked="0" layoutInCell="0" allowOverlap="1" relativeHeight="14">
+                <wp:anchor behindDoc="0" distT="0" distB="0" distL="0" distR="0" simplePos="0" locked="0" layoutInCell="0" allowOverlap="1" relativeHeight="19">
                   <wp:simplePos x="0" y="0"/>
                   <wp:positionH relativeFrom="column">
                     <wp:align>center</wp:align>
@@ -6626,7 +5775,7 @@
                   <wp:extent cx="3536315" cy="638810"/>
                   <wp:effectExtent l="0" t="0" r="0" b="0"/>
                   <wp:wrapSquare wrapText="largest"/>
-                  <wp:docPr id="17" name="Imagen16 Copia 1" descr=""/>
+                  <wp:docPr id="18" name="Imagen16 Copia 1" descr=""/>
                   <wp:cNvGraphicFramePr>
                     <a:graphicFrameLocks xmlns:a="http://schemas.openxmlformats.org/drawingml/2006/main" noChangeAspect="1"/>
                   </wp:cNvGraphicFramePr>
@@ -6634,13 +5783,13 @@
                     <a:graphicData uri="http://schemas.openxmlformats.org/drawingml/2006/picture">
                       <pic:pic xmlns:pic="http://schemas.openxmlformats.org/drawingml/2006/picture">
                         <pic:nvPicPr>
-                          <pic:cNvPr id="17" name="Imagen16 Copia 1" descr=""/>
+                          <pic:cNvPr id="18" name="Imagen16 Copia 1" descr=""/>
                           <pic:cNvPicPr>
                             <a:picLocks noChangeAspect="1" noChangeArrowheads="1"/>
                           </pic:cNvPicPr>
                         </pic:nvPicPr>
                         <pic:blipFill>
-                          <a:blip r:embed="rId18"/>
+                          <a:blip r:embed="rId19"/>
                           <a:stretch>
                             <a:fillRect/>
                           </a:stretch>
@@ -6666,7 +5815,7 @@
               <w:pStyle w:val="Header"/>
               <w:widowControl/>
               <w:suppressAutoHyphens w:val="true"/>
-              <w:overflowPunct w:val="false"/>
+              <w:overflowPunct w:val="true"/>
               <w:bidi w:val="0"/>
               <w:spacing w:before="0" w:after="0"/>
               <w:jc w:val="both"/>
@@ -6701,10 +5850,10 @@
               <w:widowControl/>
               <w:numPr>
                 <w:ilvl w:val="0"/>
-                <w:numId w:val="4"/>
+                <w:numId w:val="3"/>
               </w:numPr>
               <w:suppressAutoHyphens w:val="true"/>
-              <w:overflowPunct w:val="false"/>
+              <w:overflowPunct w:val="true"/>
               <w:bidi w:val="0"/>
               <w:spacing w:before="0" w:after="0"/>
               <w:jc w:val="both"/>
@@ -6748,7 +5897,7 @@
               <w:pStyle w:val="Header"/>
               <w:widowControl/>
               <w:suppressAutoHyphens w:val="true"/>
-              <w:overflowPunct w:val="false"/>
+              <w:overflowPunct w:val="true"/>
               <w:bidi w:val="0"/>
               <w:spacing w:before="0" w:after="0"/>
               <w:jc w:val="both"/>
@@ -6782,7 +5931,7 @@
               <w:pStyle w:val="Header"/>
               <w:widowControl/>
               <w:suppressAutoHyphens w:val="true"/>
-              <w:overflowPunct w:val="false"/>
+              <w:overflowPunct w:val="true"/>
               <w:bidi w:val="0"/>
               <w:spacing w:before="0" w:after="0"/>
               <w:jc w:val="both"/>
@@ -6810,7 +5959,7 @@
                 <w:lang w:val="es-SV" w:eastAsia="en-US" w:bidi="ar-SA"/>
               </w:rPr>
               <w:drawing>
-                <wp:anchor behindDoc="0" distT="0" distB="0" distL="0" distR="0" simplePos="0" locked="0" layoutInCell="0" allowOverlap="1" relativeHeight="21">
+                <wp:anchor behindDoc="0" distT="0" distB="0" distL="0" distR="0" simplePos="0" locked="0" layoutInCell="0" allowOverlap="1" relativeHeight="25">
                   <wp:simplePos x="0" y="0"/>
                   <wp:positionH relativeFrom="column">
                     <wp:align>center</wp:align>
@@ -6821,7 +5970,7 @@
                   <wp:extent cx="3536315" cy="532130"/>
                   <wp:effectExtent l="0" t="0" r="0" b="0"/>
                   <wp:wrapSquare wrapText="largest"/>
-                  <wp:docPr id="18" name="Imagen18" descr=""/>
+                  <wp:docPr id="19" name="Imagen18" descr=""/>
                   <wp:cNvGraphicFramePr>
                     <a:graphicFrameLocks xmlns:a="http://schemas.openxmlformats.org/drawingml/2006/main" noChangeAspect="1"/>
                   </wp:cNvGraphicFramePr>
@@ -6829,13 +5978,13 @@
                     <a:graphicData uri="http://schemas.openxmlformats.org/drawingml/2006/picture">
                       <pic:pic xmlns:pic="http://schemas.openxmlformats.org/drawingml/2006/picture">
                         <pic:nvPicPr>
-                          <pic:cNvPr id="18" name="Imagen18" descr=""/>
+                          <pic:cNvPr id="19" name="Imagen18" descr=""/>
                           <pic:cNvPicPr>
                             <a:picLocks noChangeAspect="1" noChangeArrowheads="1"/>
                           </pic:cNvPicPr>
                         </pic:nvPicPr>
                         <pic:blipFill>
-                          <a:blip r:embed="rId19"/>
+                          <a:blip r:embed="rId20"/>
                           <a:stretch>
                             <a:fillRect/>
                           </a:stretch>
@@ -6861,7 +6010,7 @@
               <w:pStyle w:val="Header"/>
               <w:widowControl/>
               <w:suppressAutoHyphens w:val="true"/>
-              <w:overflowPunct w:val="false"/>
+              <w:overflowPunct w:val="true"/>
               <w:bidi w:val="0"/>
               <w:spacing w:before="0" w:after="0"/>
               <w:jc w:val="both"/>
@@ -6896,10 +6045,10 @@
               <w:widowControl/>
               <w:numPr>
                 <w:ilvl w:val="0"/>
-                <w:numId w:val="4"/>
+                <w:numId w:val="3"/>
               </w:numPr>
               <w:suppressAutoHyphens w:val="true"/>
-              <w:overflowPunct w:val="false"/>
+              <w:overflowPunct w:val="true"/>
               <w:bidi w:val="0"/>
               <w:spacing w:before="0" w:after="0"/>
               <w:jc w:val="both"/>
@@ -6934,7 +6083,7 @@
               <w:pStyle w:val="Header"/>
               <w:widowControl/>
               <w:suppressAutoHyphens w:val="true"/>
-              <w:overflowPunct w:val="false"/>
+              <w:overflowPunct w:val="true"/>
               <w:bidi w:val="0"/>
               <w:spacing w:before="0" w:after="0"/>
               <w:jc w:val="both"/>
@@ -6961,6 +6110,51 @@
                 <w:szCs w:val="18"/>
                 <w:lang w:val="es-SV" w:eastAsia="en-US" w:bidi="ar-SA"/>
               </w:rPr>
+              <w:drawing>
+                <wp:anchor behindDoc="0" distT="0" distB="0" distL="0" distR="0" simplePos="0" locked="0" layoutInCell="0" allowOverlap="1" relativeHeight="31">
+                  <wp:simplePos x="0" y="0"/>
+                  <wp:positionH relativeFrom="column">
+                    <wp:align>center</wp:align>
+                  </wp:positionH>
+                  <wp:positionV relativeFrom="paragraph">
+                    <wp:posOffset>635</wp:posOffset>
+                  </wp:positionV>
+                  <wp:extent cx="3535680" cy="3835400"/>
+                  <wp:effectExtent l="0" t="0" r="0" b="0"/>
+                  <wp:wrapSquare wrapText="largest"/>
+                  <wp:docPr id="20" name="Imagen20" descr=""/>
+                  <wp:cNvGraphicFramePr>
+                    <a:graphicFrameLocks xmlns:a="http://schemas.openxmlformats.org/drawingml/2006/main" noChangeAspect="1"/>
+                  </wp:cNvGraphicFramePr>
+                  <a:graphic xmlns:a="http://schemas.openxmlformats.org/drawingml/2006/main">
+                    <a:graphicData uri="http://schemas.openxmlformats.org/drawingml/2006/picture">
+                      <pic:pic xmlns:pic="http://schemas.openxmlformats.org/drawingml/2006/picture">
+                        <pic:nvPicPr>
+                          <pic:cNvPr id="20" name="Imagen20" descr=""/>
+                          <pic:cNvPicPr>
+                            <a:picLocks noChangeAspect="1" noChangeArrowheads="1"/>
+                          </pic:cNvPicPr>
+                        </pic:nvPicPr>
+                        <pic:blipFill>
+                          <a:blip r:embed="rId21"/>
+                          <a:stretch>
+                            <a:fillRect/>
+                          </a:stretch>
+                        </pic:blipFill>
+                        <pic:spPr bwMode="auto">
+                          <a:xfrm>
+                            <a:off x="0" y="0"/>
+                            <a:ext cx="3535680" cy="3835400"/>
+                          </a:xfrm>
+                          <a:prstGeom prst="rect">
+                            <a:avLst/>
+                          </a:prstGeom>
+                        </pic:spPr>
+                      </pic:pic>
+                    </a:graphicData>
+                  </a:graphic>
+                </wp:anchor>
+              </w:drawing>
             </w:r>
           </w:p>
           <w:p>
@@ -6968,7 +6162,7 @@
               <w:pStyle w:val="Header"/>
               <w:widowControl/>
               <w:suppressAutoHyphens w:val="true"/>
-              <w:overflowPunct w:val="false"/>
+              <w:overflowPunct w:val="true"/>
               <w:bidi w:val="0"/>
               <w:spacing w:before="0" w:after="0"/>
               <w:jc w:val="both"/>
@@ -7002,7 +6196,7 @@
               <w:pStyle w:val="Header"/>
               <w:widowControl/>
               <w:suppressAutoHyphens w:val="true"/>
-              <w:overflowPunct w:val="false"/>
+              <w:overflowPunct w:val="true"/>
               <w:bidi w:val="0"/>
               <w:spacing w:before="0" w:after="0"/>
               <w:jc w:val="both"/>
@@ -7036,7 +6230,7 @@
               <w:pStyle w:val="Header"/>
               <w:widowControl/>
               <w:suppressAutoHyphens w:val="true"/>
-              <w:overflowPunct w:val="false"/>
+              <w:overflowPunct w:val="true"/>
               <w:bidi w:val="0"/>
               <w:spacing w:before="0" w:after="0"/>
               <w:jc w:val="left"/>
@@ -7070,7 +6264,7 @@
               <w:pStyle w:val="Header"/>
               <w:widowControl/>
               <w:suppressAutoHyphens w:val="true"/>
-              <w:overflowPunct w:val="false"/>
+              <w:overflowPunct w:val="true"/>
               <w:bidi w:val="0"/>
               <w:spacing w:before="0" w:after="0"/>
               <w:jc w:val="left"/>
@@ -7204,7 +6398,7 @@
         <w:trPr/>
         <w:tc>
           <w:tcPr>
-            <w:tcW w:w="5785" w:type="dxa"/>
+            <w:tcW w:w="5784" w:type="dxa"/>
             <w:tcBorders>
               <w:top w:val="double" w:sz="4" w:space="0" w:color="000000"/>
               <w:left w:val="double" w:sz="4" w:space="0" w:color="000000"/>
@@ -7339,7 +6533,7 @@
         <w:trPr/>
         <w:tc>
           <w:tcPr>
-            <w:tcW w:w="5785" w:type="dxa"/>
+            <w:tcW w:w="5784" w:type="dxa"/>
             <w:tcBorders>
               <w:top w:val="double" w:sz="4" w:space="0" w:color="000000"/>
               <w:left w:val="double" w:sz="4" w:space="0" w:color="000000"/>
@@ -7474,7 +6668,7 @@
         <w:trPr/>
         <w:tc>
           <w:tcPr>
-            <w:tcW w:w="5785" w:type="dxa"/>
+            <w:tcW w:w="5784" w:type="dxa"/>
             <w:tcBorders>
               <w:top w:val="double" w:sz="4" w:space="0" w:color="000000"/>
               <w:left w:val="double" w:sz="4" w:space="0" w:color="000000"/>
@@ -7609,7 +6803,7 @@
         <w:trPr/>
         <w:tc>
           <w:tcPr>
-            <w:tcW w:w="5785" w:type="dxa"/>
+            <w:tcW w:w="5784" w:type="dxa"/>
             <w:tcBorders>
               <w:top w:val="double" w:sz="4" w:space="0" w:color="000000"/>
               <w:left w:val="double" w:sz="4" w:space="0" w:color="000000"/>
@@ -7744,7 +6938,7 @@
         <w:trPr/>
         <w:tc>
           <w:tcPr>
-            <w:tcW w:w="5785" w:type="dxa"/>
+            <w:tcW w:w="5784" w:type="dxa"/>
             <w:tcBorders>
               <w:top w:val="double" w:sz="4" w:space="0" w:color="000000"/>
               <w:left w:val="double" w:sz="4" w:space="0" w:color="000000"/>
@@ -8001,12 +7195,12 @@
       </w:r>
     </w:p>
     <w:sectPr>
-      <w:headerReference w:type="even" r:id="rId20"/>
-      <w:headerReference w:type="default" r:id="rId21"/>
-      <w:headerReference w:type="first" r:id="rId22"/>
-      <w:footerReference w:type="even" r:id="rId23"/>
-      <w:footerReference w:type="default" r:id="rId24"/>
-      <w:footerReference w:type="first" r:id="rId25"/>
+      <w:headerReference w:type="even" r:id="rId22"/>
+      <w:headerReference w:type="default" r:id="rId23"/>
+      <w:headerReference w:type="first" r:id="rId24"/>
+      <w:footerReference w:type="even" r:id="rId25"/>
+      <w:footerReference w:type="default" r:id="rId26"/>
+      <w:footerReference w:type="first" r:id="rId27"/>
       <w:type w:val="oddPage"/>
       <w:pgSz w:w="12240" w:h="15840"/>
       <w:pgMar w:left="1080" w:right="1080" w:gutter="0" w:header="720" w:top="1003" w:footer="520" w:bottom="803"/>
@@ -8121,7 +7315,7 @@
         <w:rStyle w:val="Pagenumber"/>
         <w:rFonts w:cs="Arial" w:ascii="Arial" w:hAnsi="Arial"/>
       </w:rPr>
-      <w:t>7</w:t>
+      <w:t>9</w:t>
     </w:r>
     <w:r>
       <w:rPr>
@@ -8233,7 +7427,7 @@
       <w:rPr>
         <w:rStyle w:val="Pagenumber"/>
       </w:rPr>
-      <w:t>7</w:t>
+      <w:t>9</w:t>
     </w:r>
     <w:r>
       <w:rPr>
@@ -8344,7 +7538,7 @@
         <w:rStyle w:val="Pagenumber"/>
         <w:rFonts w:cs="Arial" w:ascii="Arial" w:hAnsi="Arial"/>
       </w:rPr>
-      <w:t>7</w:t>
+      <w:t>9</w:t>
     </w:r>
     <w:r>
       <w:rPr>
@@ -8371,7 +7565,7 @@
         <wp:inline distT="0" distB="0" distL="0" distR="0">
           <wp:extent cx="6053455" cy="733425"/>
           <wp:effectExtent l="0" t="0" r="0" b="0"/>
-          <wp:docPr id="19" name="Imagen 5 Copia 1 Copia 1 Copia 1 Copia 1 Copia 1 Copia 1 Copia 1 Copia 1 Copia 1 Copia 1" descr="cid:image004.jpg@01D74E57.C4EA2700"/>
+          <wp:docPr id="21" name="Imagen 5 Copia 1 Copia 1 Copia 1 Copia 1 Copia 1 Copia 1 Copia 1 Copia 1 Copia 1 Copia 1 Copia 1" descr="cid:image004.jpg@01D74E57.C4EA2700"/>
           <wp:cNvGraphicFramePr>
             <a:graphicFrameLocks xmlns:a="http://schemas.openxmlformats.org/drawingml/2006/main" noChangeAspect="1"/>
           </wp:cNvGraphicFramePr>
@@ -8379,7 +7573,7 @@
             <a:graphicData uri="http://schemas.openxmlformats.org/drawingml/2006/picture">
               <pic:pic xmlns:pic="http://schemas.openxmlformats.org/drawingml/2006/picture">
                 <pic:nvPicPr>
-                  <pic:cNvPr id="19" name="Imagen 5 Copia 1 Copia 1 Copia 1 Copia 1 Copia 1 Copia 1 Copia 1 Copia 1 Copia 1 Copia 1" descr="cid:image004.jpg@01D74E57.C4EA2700"/>
+                  <pic:cNvPr id="21" name="Imagen 5 Copia 1 Copia 1 Copia 1 Copia 1 Copia 1 Copia 1 Copia 1 Copia 1 Copia 1 Copia 1 Copia 1" descr="cid:image004.jpg@01D74E57.C4EA2700"/>
                   <pic:cNvPicPr>
                     <a:picLocks noChangeAspect="1" noChangeArrowheads="1"/>
                   </pic:cNvPicPr>
@@ -8423,7 +7617,7 @@
         <wp:inline distT="0" distB="0" distL="0" distR="0">
           <wp:extent cx="6053455" cy="733425"/>
           <wp:effectExtent l="0" t="0" r="0" b="0"/>
-          <wp:docPr id="20" name="Imagen 6 Copia 1 Copia 1 Copia 1 Copia 1 Copia 1 Copia 1 Copia 1 Copia 1 Copia 1 Copia 1" descr="cid:image004.jpg@01D74E57.C4EA2700"/>
+          <wp:docPr id="22" name="Imagen 6 Copia 1 Copia 1 Copia 1 Copia 1 Copia 1 Copia 1 Copia 1 Copia 1 Copia 1 Copia 1 Copia 1" descr="cid:image004.jpg@01D74E57.C4EA2700"/>
           <wp:cNvGraphicFramePr>
             <a:graphicFrameLocks xmlns:a="http://schemas.openxmlformats.org/drawingml/2006/main" noChangeAspect="1"/>
           </wp:cNvGraphicFramePr>
@@ -8431,7 +7625,7 @@
             <a:graphicData uri="http://schemas.openxmlformats.org/drawingml/2006/picture">
               <pic:pic xmlns:pic="http://schemas.openxmlformats.org/drawingml/2006/picture">
                 <pic:nvPicPr>
-                  <pic:cNvPr id="20" name="Imagen 6 Copia 1 Copia 1 Copia 1 Copia 1 Copia 1 Copia 1 Copia 1 Copia 1 Copia 1 Copia 1" descr="cid:image004.jpg@01D74E57.C4EA2700"/>
+                  <pic:cNvPr id="22" name="Imagen 6 Copia 1 Copia 1 Copia 1 Copia 1 Copia 1 Copia 1 Copia 1 Copia 1 Copia 1 Copia 1 Copia 1" descr="cid:image004.jpg@01D74E57.C4EA2700"/>
                   <pic:cNvPicPr>
                     <a:picLocks noChangeAspect="1" noChangeArrowheads="1"/>
                   </pic:cNvPicPr>
@@ -8481,7 +7675,7 @@
         <wp:inline distT="0" distB="0" distL="0" distR="0">
           <wp:extent cx="3619500" cy="732790"/>
           <wp:effectExtent l="0" t="0" r="0" b="0"/>
-          <wp:docPr id="21" name="Imagen 4 Copia 1 Copia 1 Copia 1 Copia 1 Copia 1 Copia 1 Copia 1 Copia 1 Copia 1 Copia 1" descr="cid:image004.jpg@01D74E57.C4EA2700"/>
+          <wp:docPr id="23" name="Imagen 4 Copia 1 Copia 1 Copia 1 Copia 1 Copia 1 Copia 1 Copia 1 Copia 1 Copia 1 Copia 1 Copia 1" descr="cid:image004.jpg@01D74E57.C4EA2700"/>
           <wp:cNvGraphicFramePr>
             <a:graphicFrameLocks xmlns:a="http://schemas.openxmlformats.org/drawingml/2006/main" noChangeAspect="1"/>
           </wp:cNvGraphicFramePr>
@@ -8489,7 +7683,7 @@
             <a:graphicData uri="http://schemas.openxmlformats.org/drawingml/2006/picture">
               <pic:pic xmlns:pic="http://schemas.openxmlformats.org/drawingml/2006/picture">
                 <pic:nvPicPr>
-                  <pic:cNvPr id="21" name="Imagen 4 Copia 1 Copia 1 Copia 1 Copia 1 Copia 1 Copia 1 Copia 1 Copia 1 Copia 1 Copia 1" descr="cid:image004.jpg@01D74E57.C4EA2700"/>
+                  <pic:cNvPr id="23" name="Imagen 4 Copia 1 Copia 1 Copia 1 Copia 1 Copia 1 Copia 1 Copia 1 Copia 1 Copia 1 Copia 1 Copia 1" descr="cid:image004.jpg@01D74E57.C4EA2700"/>
                   <pic:cNvPicPr>
                     <a:picLocks noChangeAspect="1" noChangeArrowheads="1"/>
                   </pic:cNvPicPr>
@@ -8528,7 +7722,7 @@
         <wp:inline distT="0" distB="0" distL="0" distR="0">
           <wp:extent cx="2434590" cy="733425"/>
           <wp:effectExtent l="0" t="0" r="0" b="0"/>
-          <wp:docPr id="22" name="Imagen 3 Copia 1 Copia 1 Copia 1 Copia 1 Copia 1 Copia 1 Copia 1 Copia 1 Copia 1 Copia 1" descr="cid:image004.jpg@01D74E57.C4EA2700"/>
+          <wp:docPr id="24" name="Imagen 3 Copia 1 Copia 1 Copia 1 Copia 1 Copia 1 Copia 1 Copia 1 Copia 1 Copia 1 Copia 1 Copia 1" descr="cid:image004.jpg@01D74E57.C4EA2700"/>
           <wp:cNvGraphicFramePr>
             <a:graphicFrameLocks xmlns:a="http://schemas.openxmlformats.org/drawingml/2006/main" noChangeAspect="1"/>
           </wp:cNvGraphicFramePr>
@@ -8536,7 +7730,7 @@
             <a:graphicData uri="http://schemas.openxmlformats.org/drawingml/2006/picture">
               <pic:pic xmlns:pic="http://schemas.openxmlformats.org/drawingml/2006/picture">
                 <pic:nvPicPr>
-                  <pic:cNvPr id="22" name="Imagen 3 Copia 1 Copia 1 Copia 1 Copia 1 Copia 1 Copia 1 Copia 1 Copia 1 Copia 1 Copia 1" descr="cid:image004.jpg@01D74E57.C4EA2700"/>
+                  <pic:cNvPr id="24" name="Imagen 3 Copia 1 Copia 1 Copia 1 Copia 1 Copia 1 Copia 1 Copia 1 Copia 1 Copia 1 Copia 1 Copia 1" descr="cid:image004.jpg@01D74E57.C4EA2700"/>
                   <pic:cNvPicPr>
                     <a:picLocks noChangeAspect="1" noChangeArrowheads="1"/>
                   </pic:cNvPicPr>
@@ -8632,125 +7826,6 @@
 <file path=word/numbering.xml><?xml version="1.0" encoding="utf-8"?>
 <w:numbering xmlns:w="http://schemas.openxmlformats.org/wordprocessingml/2006/main" xmlns:o="urn:schemas-microsoft-com:office:office" xmlns:r="http://schemas.openxmlformats.org/officeDocument/2006/relationships" xmlns:v="urn:schemas-microsoft-com:vml" xmlns:mc="http://schemas.openxmlformats.org/markup-compatibility/2006" xmlns:w14="http://schemas.microsoft.com/office/word/2010/wordml" mc:Ignorable="w14">
   <w:abstractNum w:abstractNumId="1">
-    <w:lvl w:ilvl="0">
-      <w:start w:val="1"/>
-      <w:numFmt w:val="none"/>
-      <w:suff w:val="nothing"/>
-      <w:lvlText w:val="%1"/>
-      <w:lvlJc w:val="left"/>
-      <w:pPr>
-        <w:tabs>
-          <w:tab w:val="num" w:pos="0"/>
-        </w:tabs>
-        <w:ind w:left="0" w:hanging="0"/>
-      </w:pPr>
-    </w:lvl>
-    <w:lvl w:ilvl="1">
-      <w:start w:val="1"/>
-      <w:numFmt w:val="none"/>
-      <w:suff w:val="nothing"/>
-      <w:lvlText w:val="%2"/>
-      <w:lvlJc w:val="left"/>
-      <w:pPr>
-        <w:tabs>
-          <w:tab w:val="num" w:pos="0"/>
-        </w:tabs>
-        <w:ind w:left="0" w:hanging="0"/>
-      </w:pPr>
-    </w:lvl>
-    <w:lvl w:ilvl="2">
-      <w:start w:val="1"/>
-      <w:numFmt w:val="none"/>
-      <w:suff w:val="nothing"/>
-      <w:lvlText w:val="%3"/>
-      <w:lvlJc w:val="left"/>
-      <w:pPr>
-        <w:tabs>
-          <w:tab w:val="num" w:pos="0"/>
-        </w:tabs>
-        <w:ind w:left="0" w:hanging="0"/>
-      </w:pPr>
-    </w:lvl>
-    <w:lvl w:ilvl="3">
-      <w:start w:val="1"/>
-      <w:numFmt w:val="none"/>
-      <w:suff w:val="nothing"/>
-      <w:lvlText w:val="%4"/>
-      <w:lvlJc w:val="left"/>
-      <w:pPr>
-        <w:tabs>
-          <w:tab w:val="num" w:pos="0"/>
-        </w:tabs>
-        <w:ind w:left="0" w:hanging="0"/>
-      </w:pPr>
-    </w:lvl>
-    <w:lvl w:ilvl="4">
-      <w:start w:val="1"/>
-      <w:numFmt w:val="none"/>
-      <w:suff w:val="nothing"/>
-      <w:lvlText w:val="%5"/>
-      <w:lvlJc w:val="left"/>
-      <w:pPr>
-        <w:tabs>
-          <w:tab w:val="num" w:pos="0"/>
-        </w:tabs>
-        <w:ind w:left="0" w:hanging="0"/>
-      </w:pPr>
-    </w:lvl>
-    <w:lvl w:ilvl="5">
-      <w:start w:val="1"/>
-      <w:numFmt w:val="none"/>
-      <w:suff w:val="nothing"/>
-      <w:lvlText w:val="%6"/>
-      <w:lvlJc w:val="left"/>
-      <w:pPr>
-        <w:tabs>
-          <w:tab w:val="num" w:pos="0"/>
-        </w:tabs>
-        <w:ind w:left="0" w:hanging="0"/>
-      </w:pPr>
-    </w:lvl>
-    <w:lvl w:ilvl="6">
-      <w:start w:val="1"/>
-      <w:numFmt w:val="none"/>
-      <w:suff w:val="nothing"/>
-      <w:lvlText w:val="%7"/>
-      <w:lvlJc w:val="left"/>
-      <w:pPr>
-        <w:tabs>
-          <w:tab w:val="num" w:pos="0"/>
-        </w:tabs>
-        <w:ind w:left="0" w:hanging="0"/>
-      </w:pPr>
-    </w:lvl>
-    <w:lvl w:ilvl="7">
-      <w:start w:val="1"/>
-      <w:numFmt w:val="none"/>
-      <w:suff w:val="nothing"/>
-      <w:lvlText w:val="%8"/>
-      <w:lvlJc w:val="left"/>
-      <w:pPr>
-        <w:tabs>
-          <w:tab w:val="num" w:pos="0"/>
-        </w:tabs>
-        <w:ind w:left="0" w:hanging="0"/>
-      </w:pPr>
-    </w:lvl>
-    <w:lvl w:ilvl="8">
-      <w:start w:val="1"/>
-      <w:numFmt w:val="none"/>
-      <w:suff w:val="nothing"/>
-      <w:lvlText w:val="%9"/>
-      <w:lvlJc w:val="left"/>
-      <w:pPr>
-        <w:tabs>
-          <w:tab w:val="num" w:pos="0"/>
-        </w:tabs>
-        <w:ind w:left="0" w:hanging="0"/>
-      </w:pPr>
-    </w:lvl>
-  </w:abstractNum>
-  <w:abstractNum w:abstractNumId="2">
     <w:lvl w:ilvl="0">
       <w:start w:val="1"/>
       <w:numFmt w:val="bullet"/>
@@ -8887,7 +7962,7 @@
       </w:rPr>
     </w:lvl>
   </w:abstractNum>
-  <w:abstractNum w:abstractNumId="3">
+  <w:abstractNum w:abstractNumId="2">
     <w:lvl w:ilvl="0">
       <w:start w:val="1"/>
       <w:numFmt w:val="bullet"/>
@@ -9024,7 +8099,7 @@
       </w:rPr>
     </w:lvl>
   </w:abstractNum>
-  <w:abstractNum w:abstractNumId="4">
+  <w:abstractNum w:abstractNumId="3">
     <w:lvl w:ilvl="0">
       <w:start w:val="1"/>
       <w:numFmt w:val="bullet"/>
@@ -9161,6 +8236,125 @@
       </w:rPr>
     </w:lvl>
   </w:abstractNum>
+  <w:abstractNum w:abstractNumId="4">
+    <w:lvl w:ilvl="0">
+      <w:start w:val="1"/>
+      <w:numFmt w:val="none"/>
+      <w:suff w:val="nothing"/>
+      <w:lvlText w:val=""/>
+      <w:lvlJc w:val="left"/>
+      <w:pPr>
+        <w:tabs>
+          <w:tab w:val="num" w:pos="0"/>
+        </w:tabs>
+        <w:ind w:left="0" w:hanging="0"/>
+      </w:pPr>
+    </w:lvl>
+    <w:lvl w:ilvl="1">
+      <w:start w:val="1"/>
+      <w:numFmt w:val="none"/>
+      <w:suff w:val="nothing"/>
+      <w:lvlText w:val=""/>
+      <w:lvlJc w:val="left"/>
+      <w:pPr>
+        <w:tabs>
+          <w:tab w:val="num" w:pos="0"/>
+        </w:tabs>
+        <w:ind w:left="0" w:hanging="0"/>
+      </w:pPr>
+    </w:lvl>
+    <w:lvl w:ilvl="2">
+      <w:start w:val="1"/>
+      <w:numFmt w:val="none"/>
+      <w:suff w:val="nothing"/>
+      <w:lvlText w:val=""/>
+      <w:lvlJc w:val="left"/>
+      <w:pPr>
+        <w:tabs>
+          <w:tab w:val="num" w:pos="0"/>
+        </w:tabs>
+        <w:ind w:left="0" w:hanging="0"/>
+      </w:pPr>
+    </w:lvl>
+    <w:lvl w:ilvl="3">
+      <w:start w:val="1"/>
+      <w:numFmt w:val="none"/>
+      <w:suff w:val="nothing"/>
+      <w:lvlText w:val=""/>
+      <w:lvlJc w:val="left"/>
+      <w:pPr>
+        <w:tabs>
+          <w:tab w:val="num" w:pos="0"/>
+        </w:tabs>
+        <w:ind w:left="0" w:hanging="0"/>
+      </w:pPr>
+    </w:lvl>
+    <w:lvl w:ilvl="4">
+      <w:start w:val="1"/>
+      <w:numFmt w:val="none"/>
+      <w:suff w:val="nothing"/>
+      <w:lvlText w:val=""/>
+      <w:lvlJc w:val="left"/>
+      <w:pPr>
+        <w:tabs>
+          <w:tab w:val="num" w:pos="0"/>
+        </w:tabs>
+        <w:ind w:left="0" w:hanging="0"/>
+      </w:pPr>
+    </w:lvl>
+    <w:lvl w:ilvl="5">
+      <w:start w:val="1"/>
+      <w:numFmt w:val="none"/>
+      <w:suff w:val="nothing"/>
+      <w:lvlText w:val=""/>
+      <w:lvlJc w:val="left"/>
+      <w:pPr>
+        <w:tabs>
+          <w:tab w:val="num" w:pos="0"/>
+        </w:tabs>
+        <w:ind w:left="0" w:hanging="0"/>
+      </w:pPr>
+    </w:lvl>
+    <w:lvl w:ilvl="6">
+      <w:start w:val="1"/>
+      <w:numFmt w:val="none"/>
+      <w:suff w:val="nothing"/>
+      <w:lvlText w:val=""/>
+      <w:lvlJc w:val="left"/>
+      <w:pPr>
+        <w:tabs>
+          <w:tab w:val="num" w:pos="0"/>
+        </w:tabs>
+        <w:ind w:left="0" w:hanging="0"/>
+      </w:pPr>
+    </w:lvl>
+    <w:lvl w:ilvl="7">
+      <w:start w:val="1"/>
+      <w:numFmt w:val="none"/>
+      <w:suff w:val="nothing"/>
+      <w:lvlText w:val=""/>
+      <w:lvlJc w:val="left"/>
+      <w:pPr>
+        <w:tabs>
+          <w:tab w:val="num" w:pos="0"/>
+        </w:tabs>
+        <w:ind w:left="0" w:hanging="0"/>
+      </w:pPr>
+    </w:lvl>
+    <w:lvl w:ilvl="8">
+      <w:start w:val="1"/>
+      <w:numFmt w:val="none"/>
+      <w:suff w:val="nothing"/>
+      <w:lvlText w:val=""/>
+      <w:lvlJc w:val="left"/>
+      <w:pPr>
+        <w:tabs>
+          <w:tab w:val="num" w:pos="0"/>
+        </w:tabs>
+        <w:ind w:left="0" w:hanging="0"/>
+      </w:pPr>
+    </w:lvl>
+  </w:abstractNum>
   <w:num w:numId="1">
     <w:abstractNumId w:val="1"/>
   </w:num>
@@ -9197,9 +8391,7 @@
     <w:pPr>
       <w:widowControl/>
       <w:suppressAutoHyphens w:val="true"/>
-      <w:kinsoku w:val="true"/>
-      <w:overflowPunct w:val="false"/>
-      <w:autoSpaceDE w:val="true"/>
+      <w:overflowPunct w:val="true"/>
       <w:bidi w:val="0"/>
       <w:spacing w:before="0" w:after="240"/>
       <w:jc w:val="left"/>
@@ -9953,9 +9145,7 @@
     <w:pPr>
       <w:widowControl/>
       <w:suppressAutoHyphens w:val="true"/>
-      <w:kinsoku w:val="true"/>
-      <w:overflowPunct w:val="false"/>
-      <w:autoSpaceDE w:val="true"/>
+      <w:overflowPunct w:val="true"/>
       <w:bidi w:val="0"/>
       <w:spacing w:before="0" w:after="0"/>
       <w:jc w:val="left"/>
@@ -9997,7 +9187,7 @@
     <w:name w:val="Body Text Indent"/>
     <w:basedOn w:val="BodyText"/>
     <w:pPr>
-      <w:overflowPunct w:val="true"/>
+      <w:overflowPunct w:val="false"/>
       <w:spacing w:lineRule="atLeast" w:line="240" w:before="0" w:after="240"/>
       <w:ind w:firstLine="360" w:left="360"/>
       <w:jc w:val="both"/>
@@ -10013,7 +9203,7 @@
     <w:basedOn w:val="Normal"/>
     <w:qFormat/>
     <w:pPr>
-      <w:overflowPunct w:val="true"/>
+      <w:overflowPunct w:val="false"/>
       <w:spacing w:before="60" w:after="60"/>
       <w:textAlignment w:val="auto"/>
     </w:pPr>
@@ -10074,7 +9264,7 @@
     <w:pPr>
       <w:numPr>
         <w:ilvl w:val="0"/>
-        <w:numId w:val="2"/>
+        <w:numId w:val="1"/>
       </w:numPr>
     </w:pPr>
     <w:rPr/>
@@ -10084,7 +9274,7 @@
     <w:basedOn w:val="BodyText"/>
     <w:qFormat/>
     <w:pPr>
-      <w:overflowPunct w:val="true"/>
+      <w:overflowPunct w:val="false"/>
       <w:spacing w:lineRule="auto" w:line="360" w:before="120" w:after="120"/>
       <w:jc w:val="both"/>
       <w:textAlignment w:val="auto"/>
@@ -10100,7 +9290,7 @@
     <w:basedOn w:val="Normal"/>
     <w:qFormat/>
     <w:pPr>
-      <w:overflowPunct w:val="true"/>
+      <w:overflowPunct w:val="false"/>
       <w:spacing w:lineRule="auto" w:line="276" w:before="0" w:after="0"/>
       <w:ind w:left="720"/>
       <w:contextualSpacing/>

</xml_diff>